<commit_message>
docs: gop de cuong NCKH thanh 3 chuong chuan theo Nhom 2 123 va chuan hoa bang tien do, san pham
</commit_message>
<xml_diff>
--- a/docs/2.Nguyễn Bình Dương_Xay Dung Website Truyen Thong Cong Doan TDMU Tich Hop AI Ho Tro Tao Va Dang Tai Noi Dung_De cuong.docx
+++ b/docs/2.Nguyễn Bình Dương_Xay Dung Website Truyen Thong Cong Doan TDMU Tich Hop AI Ho Tro Tao Va Dang Tai Noi Dung_De cuong.docx
@@ -718,7 +718,7 @@
               </wp:anchor>
             </w:drawing>
           </mc:Choice>
-          <mc:Fallback xmlns:wpsCustomData="http://www.wps.cn/officeDocument/2013/wpsCustomData" xmlns:w16cei="http://schemas.microsoft.com/office/word/2026/wordml/cei">
+          <mc:Fallback xmlns:w16cei="http://schemas.microsoft.com/office/word/2026/wordml/cei" xmlns:wpsCustomData="http://www.wps.cn/officeDocument/2013/wpsCustomData">
             <w:pict>
               <v:line id="Line 3" o:spid="_x0000_s1026" o:spt="20" style="position:absolute;left:0pt;margin-left:157.9pt;margin-top:2.55pt;height:0pt;width:113.6pt;mso-wrap-distance-bottom:0pt;mso-wrap-distance-top:0pt;z-index:251659264;mso-width-relative:page;mso-height-relative:page;" filled="f" stroked="t" coordsize="21600,21600" o:gfxdata="UEsDBAoAAAAAAIdO4kAAAAAAAAAAAAAAAAAEAAAAZHJzL1BLAwQUAAAACACHTuJA6+URjdUAAAAH AQAADwAAAGRycy9kb3ducmV2LnhtbE2PvU7DQBCEeyTe4bRINFFydowjZHxOAbijIQHRbnyLbeHb c3yXH3h6FhooRzOa+aZcn92gjjSF3rOBdJGAIm687bk18LKt57egQkS2OHgmA58UYF1dXpRYWH/i ZzpuYqukhEOBBroYx0Lr0HTkMCz8SCzeu58cRpFTq+2EJyl3g14myUo77FkWOhzpvqPmY3NwBkL9 Svv6a9bMkres9bTcPzw9ojHXV2lyByrSOf6F4Qdf0KESpp0/sA1qMJCluaBHA3kKSvz8JpNvu1+t q1L/56++AVBLAwQUAAAACACHTuJAx0uUO9ABAACqAwAADgAAAGRycy9lMm9Eb2MueG1srVNNb9sw DL0P2H8QdF+ceO0+jDg9JOgu2Rag3Q9QZNkWKomCqMTOvx8lJ2nXXXqoD4Ioko98j/TybrSGHVVA Da7mi9mcM+UkNNp1Nf/zeP/pG2cYhWuEAadqflLI71YfPywHX6kSejCNCoxAHFaDr3kfo6+KAmWv rMAZeOXI2UKwIpIZuqIJYiB0a4pyPv9SDBAaH0AqRHrdTE5+RgxvAYS21VJtQB6scnFCDcqISJSw 1x75KnfbtkrG322LKjJTc2Ia80lF6L5PZ7FaiqoLwvdanlsQb2nhFScrtKOiV6iNiIIdgv4PymoZ AKGNMwm2mIhkRYjFYv5Km4deeJW5kNTor6Lj+8HKX8ddYLqhTeDMCUsD32qn2OekzOCxooC124XE TY7uwW9BPiFzsO6F61Tu8PHkKW2RMop/UpKBnvD3w09oKEYcImSZxjbYBEkCsDFP43Sdhhojk/S4 uLkpv5Y0KHnxFaK6JPqA8YcCy9Kl5oZ6zsDiuMWYGhHVJSTVcXCvjcnDNo4NNf9+W94SsvXEHF2X cxGMblJcysDQ7dcmsKNIm5O/TJA8L8MCHFwz1TPuzD9RnsTbQ3PahYsuNMLc2Hnd0o68tHP28y+2 +gtQSwMECgAAAAAAh07iQAAAAAAAAAAAAAAAAAYAAABfcmVscy9QSwMEFAAAAAgAh07iQIoUZjzR AAAAlAEAAAsAAABfcmVscy8ucmVsc6WQwWrDMAyG74O9g9F9cZrDGKNOL6PQa+kewNiKYxpbRjLZ +vbzDoNl9LajfqHvE//+8JkWtSJLpGxg1/WgMDvyMQcD75fj0wsoqTZ7u1BGAzcUOIyPD/szLra2 I5ljEdUoWQzMtZZXrcXNmKx0VDC3zUScbG0jB12su9qAeuj7Z82/GTBumOrkDfDJD6Aut9LMf9gp OiahqXaOkqZpiu4eVQe2ZY7uyDbhG7lGsxywGvAsGgdqWdd+BH1fv/un3tNHPuO61X6HjOuPV2+6 HL8AUEsDBBQAAAAIAIdO4kB+5uUg9wAAAOEBAAATAAAAW0NvbnRlbnRfVHlwZXNdLnhtbJWRQU7D MBBF90jcwfIWJU67QAgl6YK0S0CoHGBkTxKLZGx5TGhvj5O2G0SRWNoz/78nu9wcxkFMGNg6quQq L6RA0s5Y6ir5vt9lD1JwBDIwOMJKHpHlpr69KfdHjyxSmriSfYz+USnWPY7AufNIadK6MEJMx9Ap D/oDOlTrorhX2lFEilmcO2RdNtjC5xDF9pCuTyYBB5bi6bQ4syoJ3g9WQ0ymaiLzg5KdCXlKLjvc W893SUOqXwnz5DrgnHtJTxOsQfEKIT7DmDSUCayM+6KAU/53yWw5cuba1mrMm8BNir3hdLG61o5r 1zj93/Ltkrp0q+WD6m9QSwECFAAUAAAACACHTuJAfublIPcAAADhAQAAEwAAAAAAAAABACAAAAA+ BAAAW0NvbnRlbnRfVHlwZXNdLnhtbFBLAQIUAAoAAAAAAIdO4kAAAAAAAAAAAAAAAAAGAAAAAAAA AAAAEAAAACADAABfcmVscy9QSwECFAAUAAAACACHTuJAihRmPNEAAACUAQAACwAAAAAAAAABACAA AABEAwAAX3JlbHMvLnJlbHNQSwECFAAKAAAAAACHTuJAAAAAAAAAAAAAAAAABAAAAAAAAAAAABAA AAAAAAAAZHJzL1BLAQIUABQAAAAIAIdO4kDr5RGN1QAAAAcBAAAPAAAAAAAAAAEAIAAAACIAAABk cnMvZG93bnJldi54bWxQSwECFAAUAAAACACHTuJAx0uUO9ABAACqAwAADgAAAAAAAAABACAAAAAk AQAAZHJzL2Uyb0RvYy54bWxQSwUGAAAAAAYABgBZAQAAZgUAAAAA ">
                 <v:fill on="f" focussize="0,0"/>
@@ -813,7 +813,7 @@
     </w:p>
     <w:p>
       <w:pPr>
-        <w:pStyle w:val="Heading1"/>
+        <w:pStyle w:val="u1"/>
         <w:numPr>
           <w:ilvl w:val="0"/>
           <w:numId w:val="1"/>
@@ -870,7 +870,7 @@
     </w:p>
     <w:p>
       <w:pPr>
-        <w:pStyle w:val="Heading1"/>
+        <w:pStyle w:val="u1"/>
         <w:numPr>
           <w:ilvl w:val="0"/>
           <w:numId w:val="1"/>
@@ -965,7 +965,7 @@
     </w:p>
     <w:p>
       <w:pPr>
-        <w:pStyle w:val="Heading1"/>
+        <w:pStyle w:val="u1"/>
         <w:numPr>
           <w:ilvl w:val="0"/>
           <w:numId w:val="1"/>
@@ -1279,7 +1279,7 @@
     </w:p>
     <w:p>
       <w:pPr>
-        <w:pStyle w:val="Heading1"/>
+        <w:pStyle w:val="u1"/>
         <w:numPr>
           <w:ilvl w:val="0"/>
           <w:numId w:val="1"/>
@@ -1350,7 +1350,7 @@
     </w:p>
     <w:p>
       <w:pPr>
-        <w:pStyle w:val="ListParagraph"/>
+        <w:pStyle w:val="oancuaDanhsach"/>
         <w:keepNext/>
         <w:numPr>
           <w:ilvl w:val="0"/>
@@ -1441,7 +1441,7 @@
     </w:p>
     <w:p>
       <w:pPr>
-        <w:pStyle w:val="ListParagraph"/>
+        <w:pStyle w:val="oancuaDanhsach"/>
         <w:keepNext/>
         <w:numPr>
           <w:ilvl w:val="0"/>
@@ -1483,6 +1483,7 @@
         <w:rPr>
           <w:sz w:val="26"/>
           <w:szCs w:val="26"/>
+          <w:lang w:val="vi-VN"/>
         </w:rPr>
       </w:pPr>
       <w:r>
@@ -1506,6 +1507,7 @@
         <w:rPr>
           <w:sz w:val="26"/>
           <w:szCs w:val="26"/>
+          <w:lang w:val="vi-VN"/>
         </w:rPr>
         <w:t>ĩ</w:t>
       </w:r>
@@ -1602,7 +1604,7 @@
     </w:p>
     <w:p>
       <w:pPr>
-        <w:pStyle w:val="Heading1"/>
+        <w:pStyle w:val="u1"/>
         <w:numPr>
           <w:ilvl w:val="0"/>
           <w:numId w:val="1"/>
@@ -2271,7 +2273,7 @@
     </w:p>
     <w:p>
       <w:pPr>
-        <w:pStyle w:val="ListParagraph"/>
+        <w:pStyle w:val="oancuaDanhsach"/>
         <w:numPr>
           <w:ilvl w:val="0"/>
           <w:numId w:val="1"/>
@@ -2389,7 +2391,7 @@
     </w:p>
     <w:p>
       <w:pPr>
-        <w:pStyle w:val="Heading4"/>
+        <w:pStyle w:val="u4"/>
         <w:keepNext w:val="0"/>
         <w:numPr>
           <w:ilvl w:val="1"/>
@@ -2419,7 +2421,7 @@
       </w:pPr>
       <w:r>
         <w:rPr>
-          <w:rStyle w:val="Strong"/>
+          <w:rStyle w:val="Manh"/>
         </w:rPr>
         <w:lastRenderedPageBreak/>
         <w:t>Quản trị nội dung &amp; Quy trình xuất bản:</w:t>
@@ -2470,7 +2472,7 @@
     </w:p>
     <w:p>
       <w:pPr>
-        <w:pStyle w:val="Heading4"/>
+        <w:pStyle w:val="u4"/>
         <w:keepNext w:val="0"/>
         <w:numPr>
           <w:ilvl w:val="1"/>
@@ -2500,7 +2502,7 @@
       </w:pPr>
       <w:r>
         <w:rPr>
-          <w:rStyle w:val="Strong"/>
+          <w:rStyle w:val="Manh"/>
         </w:rPr>
         <w:t>Thiết kế trên Figma:</w:t>
       </w:r>
@@ -2514,7 +2516,7 @@
       </w:pPr>
       <w:r>
         <w:rPr>
-          <w:rStyle w:val="Strong"/>
+          <w:rStyle w:val="Manh"/>
         </w:rPr>
         <w:t>Xây dựng Design System:</w:t>
       </w:r>
@@ -2528,7 +2530,7 @@
       </w:pPr>
       <w:r>
         <w:rPr>
-          <w:rStyle w:val="Strong"/>
+          <w:rStyle w:val="Manh"/>
         </w:rPr>
         <w:t>Thiết kế giao diện Portal:</w:t>
       </w:r>
@@ -2542,7 +2544,7 @@
       </w:pPr>
       <w:r>
         <w:rPr>
-          <w:rStyle w:val="Strong"/>
+          <w:rStyle w:val="Manh"/>
         </w:rPr>
         <w:t>Thiết kế giao diện Quản trị:</w:t>
       </w:r>
@@ -2556,7 +2558,7 @@
       </w:pPr>
       <w:r>
         <w:rPr>
-          <w:rStyle w:val="Strong"/>
+          <w:rStyle w:val="Manh"/>
         </w:rPr>
         <w:t>Thiết kế Responsive:</w:t>
       </w:r>
@@ -2566,7 +2568,7 @@
     </w:p>
     <w:p>
       <w:pPr>
-        <w:pStyle w:val="Heading4"/>
+        <w:pStyle w:val="u4"/>
         <w:keepNext w:val="0"/>
         <w:numPr>
           <w:ilvl w:val="1"/>
@@ -2587,6 +2589,7 @@
           <w:szCs w:val="26"/>
           <w:lang w:val="vi-VN"/>
         </w:rPr>
+        <w:lastRenderedPageBreak/>
         <w:t>Về kỹ thuật:</w:t>
       </w:r>
     </w:p>
@@ -2648,7 +2651,7 @@
     </w:p>
     <w:p>
       <w:pPr>
-        <w:pStyle w:val="Heading4"/>
+        <w:pStyle w:val="u4"/>
         <w:keepNext w:val="0"/>
         <w:numPr>
           <w:ilvl w:val="1"/>
@@ -2678,7 +2681,7 @@
       </w:pPr>
       <w:r>
         <w:rPr>
-          <w:rStyle w:val="Strong"/>
+          <w:rStyle w:val="Manh"/>
         </w:rPr>
         <w:t>Số hóa truyền thông Công đoàn:</w:t>
       </w:r>
@@ -2692,7 +2695,7 @@
       </w:pPr>
       <w:r>
         <w:rPr>
-          <w:rStyle w:val="Strong"/>
+          <w:rStyle w:val="Manh"/>
         </w:rPr>
         <w:t>Tiết kiệm thời gian &amp; nguồn lực:</w:t>
       </w:r>
@@ -2706,8 +2709,9 @@
       </w:pPr>
       <w:r>
         <w:rPr>
-          <w:rStyle w:val="Strong"/>
-        </w:rPr>
+          <w:rStyle w:val="Manh"/>
+        </w:rPr>
+        <w:lastRenderedPageBreak/>
         <w:t>Quy trình khép kín &amp; kiểm soát nội dung:</w:t>
       </w:r>
       <w:r>
@@ -2720,7 +2724,7 @@
       </w:pPr>
       <w:r>
         <w:rPr>
-          <w:rStyle w:val="Strong"/>
+          <w:rStyle w:val="Manh"/>
         </w:rPr>
         <w:t>Theo dõi &amp; mở rộng:</w:t>
       </w:r>
@@ -2730,7 +2734,7 @@
     </w:p>
     <w:p>
       <w:pPr>
-        <w:pStyle w:val="ListParagraph"/>
+        <w:pStyle w:val="oancuaDanhsach"/>
         <w:keepNext/>
         <w:numPr>
           <w:ilvl w:val="0"/>
@@ -2776,19 +2780,19 @@
       </w:pPr>
       <w:r>
         <w:rPr>
-          <w:rStyle w:val="Strong"/>
+          <w:rStyle w:val="Manh"/>
         </w:rPr>
         <w:t>1</w:t>
       </w:r>
       <w:r>
         <w:rPr>
-          <w:rStyle w:val="Strong"/>
+          <w:rStyle w:val="Manh"/>
         </w:rPr>
         <w:t>0.1.</w:t>
       </w:r>
       <w:r>
         <w:rPr>
-          <w:rStyle w:val="Strong"/>
+          <w:rStyle w:val="Manh"/>
         </w:rPr>
         <w:t xml:space="preserve"> Các nền tảng quản lý truyền thông tích hợp AI:</w:t>
       </w:r>
@@ -2802,27 +2806,29 @@
     </w:p>
     <w:p>
       <w:pPr>
-        <w:pStyle w:val="NormalWeb"/>
+        <w:pStyle w:val="ThngthngWeb"/>
         <w:shd w:val="clear" w:color="auto" w:fill="FFFFFF" w:themeFill="background1"/>
         <w:spacing w:before="0" w:after="0"/>
         <w:ind w:left="426"/>
         <w:rPr>
-          <w:rStyle w:val="Strong"/>
-          <w:sz w:val="26"/>
-          <w:szCs w:val="26"/>
-        </w:rPr>
-      </w:pPr>
-      <w:r>
-        <w:rPr>
-          <w:rStyle w:val="Strong"/>
-          <w:sz w:val="26"/>
-          <w:szCs w:val="26"/>
+          <w:rStyle w:val="Manh"/>
+          <w:sz w:val="26"/>
+          <w:szCs w:val="26"/>
+          <w:lang w:val="vi-VN"/>
+        </w:rPr>
+      </w:pPr>
+      <w:r>
+        <w:rPr>
+          <w:rStyle w:val="Manh"/>
+          <w:sz w:val="26"/>
+          <w:szCs w:val="26"/>
+          <w:lang w:val="vi-VN"/>
         </w:rPr>
         <w:t>10.2.</w:t>
       </w:r>
       <w:r>
         <w:rPr>
-          <w:rStyle w:val="Strong"/>
+          <w:rStyle w:val="Manh"/>
           <w:sz w:val="26"/>
           <w:szCs w:val="26"/>
           <w:lang w:val="vi-VN"/>
@@ -2840,22 +2846,18 @@
       </w:r>
       <w:r>
         <w:rPr>
-          <w:rStyle w:val="Strong"/>
+          <w:rStyle w:val="Manh"/>
           <w:b w:val="0"/>
           <w:bCs w:val="0"/>
         </w:rPr>
         <w:t>Website Công đoàn Trường Đại học Công nghiệp TP.HCM (IUH), Công đoàn Trường Đại học Nha Trang (NTU) và Công đoàn Trường Đại học Lâm nghiệp</w:t>
       </w:r>
       <w:r>
-        <w:t xml:space="preserve">. Các hệ thống đã đáp ứng việc đăng tải tin tức, thông báo, văn bản, sự kiện </w:t>
-      </w:r>
-      <w:r>
-        <w:lastRenderedPageBreak/>
-        <w:t xml:space="preserve">và thông tin hoạt động Công đoàn. Tuy nhiên, các hệ thống chủ yếu tập trung vào cung cấp thông tin, chưa tích hợp sâu </w:t>
-      </w:r>
-      <w:r>
-        <w:rPr>
-          <w:rStyle w:val="Strong"/>
+        <w:t xml:space="preserve">. Các hệ thống đã đáp ứng việc đăng tải tin tức, thông báo, văn bản, sự kiện và thông tin hoạt động Công đoàn. Tuy nhiên, các hệ thống chủ yếu tập trung vào cung cấp thông tin, chưa tích hợp sâu </w:t>
+      </w:r>
+      <w:r>
+        <w:rPr>
+          <w:rStyle w:val="Manh"/>
           <w:b w:val="0"/>
           <w:bCs w:val="0"/>
         </w:rPr>
@@ -2871,7 +2873,7 @@
       </w:pPr>
       <w:r>
         <w:rPr>
-          <w:rStyle w:val="Strong"/>
+          <w:rStyle w:val="Manh"/>
         </w:rPr>
         <w:t>10.3. Hướng giải quyết và điểm mới của đề tài:</w:t>
       </w:r>
@@ -2884,7 +2886,7 @@
       </w:r>
       <w:r>
         <w:rPr>
-          <w:rStyle w:val="Strong"/>
+          <w:rStyle w:val="Manh"/>
         </w:rPr>
         <w:t>“Xây dựng Website truyền thông Công đoàn TDMU tích hợp AI hỗ trợ tạo và đăng tải nội dung”</w:t>
       </w:r>
@@ -2925,6 +2927,7 @@
         </w:numPr>
       </w:pPr>
       <w:r>
+        <w:lastRenderedPageBreak/>
         <w:t>Phân quyền RBAC 4 vai trò rõ rệt kết hợp phân hệ số hóa Quản lý Phong trào &amp; Thi đua 16 Tổ Công đoàn trực thuộc (nộp báo cáo tháng online, đính kèm minh chứng, chấm điểm theo tiêu chí và công bố bảng xếp hạng trực quan).</w:t>
       </w:r>
     </w:p>
@@ -2962,7 +2965,7 @@
     </w:p>
     <w:p>
       <w:pPr>
-        <w:pStyle w:val="ListParagraph"/>
+        <w:pStyle w:val="oancuaDanhsach"/>
         <w:keepNext/>
         <w:numPr>
           <w:ilvl w:val="0"/>
@@ -2996,7 +2999,7 @@
     </w:p>
     <w:p>
       <w:pPr>
-        <w:pStyle w:val="ListParagraph"/>
+        <w:pStyle w:val="oancuaDanhsach"/>
         <w:numPr>
           <w:ilvl w:val="1"/>
           <w:numId w:val="1"/>
@@ -3034,7 +3037,7 @@
       </w:r>
       <w:r>
         <w:rPr>
-          <w:rStyle w:val="Strong"/>
+          <w:rStyle w:val="Manh"/>
           <w:b w:val="0"/>
           <w:bCs w:val="0"/>
         </w:rPr>
@@ -3054,7 +3057,7 @@
       </w:pPr>
       <w:r>
         <w:rPr>
-          <w:rStyle w:val="Strong"/>
+          <w:rStyle w:val="Manh"/>
         </w:rPr>
         <w:t>Ban Chấp hành Công đoàn:</w:t>
       </w:r>
@@ -3088,21 +3091,17 @@
       </w:pPr>
       <w:r>
         <w:rPr>
-          <w:rStyle w:val="Strong"/>
+          <w:rStyle w:val="Manh"/>
         </w:rPr>
         <w:t>Đoàn viên, cán bộ, giảng viên, sinh viên và người lao động:</w:t>
       </w:r>
       <w:r>
-        <w:t xml:space="preserve"> là nhóm người tiếp nhận nội dung truyền thông của Công đoàn. Nhu cầu của nhóm này được nghiên cứu nhằm đánh giá khả năng tra cứu, tiếp nhận và tương </w:t>
-      </w:r>
-      <w:r>
-        <w:lastRenderedPageBreak/>
-        <w:t>tác với tin tức, thông báo, hoạt động và các nội dung được đăng tải trên hệ thống.</w:t>
-      </w:r>
-    </w:p>
-    <w:p>
-      <w:pPr>
-        <w:pStyle w:val="ListParagraph"/>
+        <w:t xml:space="preserve"> là nhóm người tiếp nhận nội dung truyền thông của Công đoàn. Nhu cầu của nhóm này được nghiên cứu nhằm đánh giá khả năng tra cứu, tiếp nhận và tương tác với tin tức, thông báo, hoạt động và các nội dung được đăng tải trên hệ thống.</w:t>
+      </w:r>
+    </w:p>
+    <w:p>
+      <w:pPr>
+        <w:pStyle w:val="oancuaDanhsach"/>
         <w:numPr>
           <w:ilvl w:val="1"/>
           <w:numId w:val="1"/>
@@ -3151,6 +3150,7 @@
         </w:numPr>
       </w:pPr>
       <w:r>
+        <w:lastRenderedPageBreak/>
         <w:t>Về nội dung: đề tài tập trung vào 6 phân hệ chức năng cốt lõi (với 26 Use Case chi tiết): (1) Cổng thông tin &amp; Tương tác đoàn viên; (2) Quản trị nội dung (CMS) &amp; Quy trình xuất bản 4 bước; (3) Trợ lý AI Copilot CMS &amp; Sáng tạo nội dung đa năng; (4) Quản lý Phong trào &amp; Thi đua 16 Tổ Công đoàn trực thuộc; (5) Tiện ích, Thăm dò &amp; Khảo sát ý kiến đoàn viên; (6) Quản trị Hệ thống, Phân quyền RBAC &amp; Giám sát kiểm toán.</w:t>
       </w:r>
     </w:p>
@@ -3180,7 +3180,7 @@
     </w:p>
     <w:p>
       <w:pPr>
-        <w:pStyle w:val="ListParagraph"/>
+        <w:pStyle w:val="oancuaDanhsach"/>
         <w:numPr>
           <w:ilvl w:val="1"/>
           <w:numId w:val="1"/>
@@ -3260,7 +3260,7 @@
     </w:p>
     <w:p>
       <w:pPr>
-        <w:pStyle w:val="ListParagraph"/>
+        <w:pStyle w:val="oancuaDanhsach"/>
         <w:numPr>
           <w:ilvl w:val="1"/>
           <w:numId w:val="1"/>
@@ -3291,7 +3291,7 @@
     </w:p>
     <w:p>
       <w:pPr>
-        <w:pStyle w:val="NormalWeb"/>
+        <w:pStyle w:val="ThngthngWeb"/>
         <w:numPr>
           <w:ilvl w:val="0"/>
           <w:numId w:val="9"/>
@@ -3307,23 +3307,23 @@
       </w:pPr>
       <w:r>
         <w:rPr>
-          <w:rStyle w:val="Strong"/>
+          <w:rStyle w:val="Manh"/>
           <w:b w:val="0"/>
           <w:bCs w:val="0"/>
           <w:sz w:val="26"/>
           <w:szCs w:val="26"/>
           <w:lang w:val="vi-VN"/>
         </w:rPr>
-        <w:lastRenderedPageBreak/>
         <w:t>Phương pháp khảo sát và phân tích</w:t>
       </w:r>
       <w:r>
         <w:rPr>
-          <w:rStyle w:val="Strong"/>
+          <w:rStyle w:val="Manh"/>
           <w:b w:val="0"/>
           <w:bCs w:val="0"/>
           <w:sz w:val="26"/>
           <w:szCs w:val="26"/>
+          <w:lang w:val="vi-VN"/>
         </w:rPr>
         <w:t>:</w:t>
       </w:r>
@@ -3337,6 +3337,7 @@
         </w:numPr>
       </w:pPr>
       <w:r>
+        <w:lastRenderedPageBreak/>
         <w:t>Khảo sát quy trình truyền thông hiện tại của Công đoàn TDMU</w:t>
       </w:r>
     </w:p>
@@ -3603,6 +3604,7 @@
         </w:numPr>
       </w:pPr>
       <w:r>
+        <w:lastRenderedPageBreak/>
         <w:t>Nghiên cứu và thử nghiệm kết nối Facebook Graph API trong phạm vi điều kiện cho phép.</w:t>
       </w:r>
     </w:p>
@@ -3644,7 +3646,7 @@
     </w:p>
     <w:p>
       <w:pPr>
-        <w:pStyle w:val="ListParagraph"/>
+        <w:pStyle w:val="oancuaDanhsach"/>
         <w:numPr>
           <w:ilvl w:val="0"/>
           <w:numId w:val="1"/>
@@ -3676,7 +3678,7 @@
     </w:p>
     <w:p>
       <w:pPr>
-        <w:pStyle w:val="ListParagraph"/>
+        <w:pStyle w:val="oancuaDanhsach"/>
         <w:numPr>
           <w:ilvl w:val="1"/>
           <w:numId w:val="1"/>
@@ -3722,318 +3724,340 @@
     <w:p>
       <w:pPr>
         <w:spacing w:before="120" w:after="40"/>
+        <w:rPr>
+          <w:sz w:val="26"/>
+          <w:szCs w:val="26"/>
+          <w:lang w:val="vi-VN"/>
+        </w:rPr>
+      </w:pPr>
+      <w:r>
+        <w:rPr>
+          <w:b/>
+          <w:sz w:val="26"/>
+          <w:szCs w:val="26"/>
+          <w:lang w:val="vi-VN"/>
+        </w:rPr>
+        <w:t>Chương 1: Tổng quan và khảo sát hiện trạng</w:t>
+      </w:r>
+    </w:p>
+    <w:p>
+      <w:pPr>
+        <w:pStyle w:val="oancuaDanhsach"/>
+        <w:spacing w:before="20" w:after="30" w:line="276" w:lineRule="auto"/>
+        <w:rPr>
+          <w:sz w:val="26"/>
+          <w:szCs w:val="26"/>
+          <w:lang w:val="vi-VN"/>
+        </w:rPr>
       </w:pPr>
       <w:r>
         <w:rPr>
           <w:rFonts w:ascii="Times New Roman" w:hAnsi="Times New Roman"/>
+          <w:sz w:val="26"/>
+          <w:szCs w:val="26"/>
+          <w:lang w:val="vi-VN"/>
+        </w:rPr>
+        <w:t>1.1. Khảo sát hiện trạng công tác truyền thông tại Công đoàn TDMU (khó khăn kiêm nhiệm, phân tán kênh, thiếu công cụ đo lường)</w:t>
+      </w:r>
+    </w:p>
+    <w:p>
+      <w:pPr>
+        <w:pStyle w:val="oancuaDanhsach"/>
+        <w:spacing w:before="20" w:after="30" w:line="276" w:lineRule="auto"/>
+        <w:rPr>
+          <w:sz w:val="26"/>
+          <w:szCs w:val="26"/>
+          <w:lang w:val="vi-VN"/>
+        </w:rPr>
+      </w:pPr>
+      <w:r>
+        <w:rPr>
+          <w:rFonts w:ascii="Times New Roman" w:hAnsi="Times New Roman"/>
+          <w:sz w:val="26"/>
+          <w:szCs w:val="26"/>
+          <w:lang w:val="vi-VN"/>
+        </w:rPr>
+        <w:t>1.2. Khảo sát phần cứng và hạ tầng công nghệ</w:t>
+      </w:r>
+    </w:p>
+    <w:p>
+      <w:pPr>
+        <w:pStyle w:val="oancuaDanhsach"/>
+        <w:spacing w:before="20" w:after="30" w:line="276" w:lineRule="auto"/>
+        <w:rPr>
+          <w:sz w:val="26"/>
+          <w:szCs w:val="26"/>
+          <w:lang w:val="vi-VN"/>
+        </w:rPr>
+      </w:pPr>
+      <w:r>
+        <w:rPr>
+          <w:rFonts w:ascii="Times New Roman" w:hAnsi="Times New Roman"/>
+          <w:sz w:val="26"/>
+          <w:szCs w:val="26"/>
+          <w:lang w:val="vi-VN"/>
+        </w:rPr>
+        <w:t>1.3. Khảo sát nhu cầu (Kế hoạch khảo sát và biên bản phỏng vấn thực tế với Lãnh đạo Công đoàn và Biên tập viên)</w:t>
+      </w:r>
+    </w:p>
+    <w:p>
+      <w:pPr>
+        <w:pStyle w:val="oancuaDanhsach"/>
+        <w:spacing w:before="20" w:after="30" w:line="276" w:lineRule="auto"/>
+        <w:rPr>
+          <w:sz w:val="26"/>
+          <w:szCs w:val="26"/>
+          <w:lang w:val="vi-VN"/>
+        </w:rPr>
+      </w:pPr>
+      <w:r>
+        <w:rPr>
+          <w:rFonts w:ascii="Times New Roman" w:hAnsi="Times New Roman"/>
+          <w:sz w:val="26"/>
+          <w:szCs w:val="26"/>
+          <w:lang w:val="vi-VN"/>
+        </w:rPr>
+        <w:t>1.4. Phân tích yêu cầu hệ thống (Yêu cầu phía người dùng và Yêu cầu phía quản lý)</w:t>
+      </w:r>
+    </w:p>
+    <w:p>
+      <w:pPr>
+        <w:pStyle w:val="oancuaDanhsach"/>
+        <w:spacing w:before="20" w:after="30" w:line="276" w:lineRule="auto"/>
+        <w:rPr>
+          <w:sz w:val="26"/>
+          <w:szCs w:val="26"/>
+          <w:lang w:val="vi-VN"/>
+        </w:rPr>
+      </w:pPr>
+      <w:r>
+        <w:rPr>
+          <w:rFonts w:ascii="Times New Roman" w:hAnsi="Times New Roman"/>
+          <w:sz w:val="26"/>
+          <w:szCs w:val="26"/>
+          <w:lang w:val="vi-VN"/>
+        </w:rPr>
+        <w:t>1.5. Phân tích chức năng hệ thống (Danh mục chức năng người dùng và Danh mục chức năng người quản trị)</w:t>
+      </w:r>
+    </w:p>
+    <w:p>
+      <w:pPr>
+        <w:spacing w:before="120" w:after="40"/>
+        <w:rPr>
+          <w:sz w:val="26"/>
+          <w:szCs w:val="26"/>
+          <w:lang w:val="vi-VN"/>
+        </w:rPr>
+      </w:pPr>
+      <w:r>
+        <w:rPr>
+          <w:rFonts w:ascii="Times New Roman" w:hAnsi="Times New Roman" w:cs="Times New Roman" w:eastAsia="Times New Roman"/>
           <w:b/>
-          <w:sz w:val="22"/>
-        </w:rPr>
-        <w:t>Chương 1: Tổng quan và khảo sát hiện trạng</w:t>
-      </w:r>
-    </w:p>
-    <w:p>
-      <w:pPr>
-        <w:pStyle w:val="ListParagraph"/>
+          <w:sz w:val="26"/>
+        </w:rPr>
+        <w:t>Chương 2: Phân tích hệ thống theo chuẩn UML</w:t>
+      </w:r>
+    </w:p>
+    <w:p>
+      <w:pPr>
+        <w:pStyle w:val="oancuaDanhsach"/>
         <w:spacing w:before="20" w:after="30" w:line="276" w:lineRule="auto"/>
+        <w:rPr>
+          <w:sz w:val="26"/>
+          <w:szCs w:val="26"/>
+        </w:rPr>
       </w:pPr>
       <w:r>
         <w:rPr>
           <w:rFonts w:ascii="Times New Roman" w:hAnsi="Times New Roman"/>
-          <w:sz w:val="20"/>
-        </w:rPr>
-        <w:t>1.1. Khảo sát hiện trạng công tác truyền thông tại Công đoàn TDMU (khó khăn kiêm nhiệm, phân tán kênh, thiếu công cụ đo lường)</w:t>
-      </w:r>
-    </w:p>
-    <w:p>
-      <w:pPr>
-        <w:pStyle w:val="ListParagraph"/>
+          <w:sz w:val="26"/>
+          <w:szCs w:val="26"/>
+        </w:rPr>
+        <w:t>2.1. Danh sách và cấu trúc phân cấp các Actor (4 Actor con người: Admin, Editor, Contributor, User + 3 Actor dịch vụ ngoài)</w:t>
+      </w:r>
+    </w:p>
+    <w:p>
+      <w:pPr>
+        <w:pStyle w:val="oancuaDanhsach"/>
         <w:spacing w:before="20" w:after="30" w:line="276" w:lineRule="auto"/>
+        <w:rPr>
+          <w:sz w:val="26"/>
+          <w:szCs w:val="26"/>
+        </w:rPr>
       </w:pPr>
       <w:r>
         <w:rPr>
           <w:rFonts w:ascii="Times New Roman" w:hAnsi="Times New Roman"/>
-          <w:sz w:val="20"/>
-        </w:rPr>
-        <w:t>1.2. Khảo sát phần cứng và hạ tầng công nghệ</w:t>
-      </w:r>
-    </w:p>
-    <w:p>
-      <w:pPr>
-        <w:pStyle w:val="ListParagraph"/>
+          <w:sz w:val="26"/>
+          <w:szCs w:val="26"/>
+        </w:rPr>
+        <w:t>2.2. Danh mục 26 Use Case chức năng hệ thống</w:t>
+      </w:r>
+    </w:p>
+    <w:p>
+      <w:pPr>
+        <w:pStyle w:val="oancuaDanhsach"/>
         <w:spacing w:before="20" w:after="30" w:line="276" w:lineRule="auto"/>
+        <w:rPr>
+          <w:sz w:val="26"/>
+          <w:szCs w:val="26"/>
+        </w:rPr>
       </w:pPr>
       <w:r>
         <w:rPr>
           <w:rFonts w:ascii="Times New Roman" w:hAnsi="Times New Roman"/>
-          <w:sz w:val="20"/>
-        </w:rPr>
-        <w:t>1.3. Khảo sát nhu cầu (Kế hoạch khảo sát và biên bản phỏng vấn thực tế với Lãnh đạo Công đoàn và Biên tập viên)</w:t>
-      </w:r>
-    </w:p>
-    <w:p>
-      <w:pPr>
-        <w:pStyle w:val="ListParagraph"/>
+          <w:sz w:val="26"/>
+          <w:szCs w:val="26"/>
+        </w:rPr>
+        <w:t>2.3. Ma trận quan hệ Use Case (&lt;&lt;include&gt;&gt;, &lt;&lt;extend&gt;&gt;) và Ma trận phân quyền CRUD</w:t>
+      </w:r>
+    </w:p>
+    <w:p>
+      <w:pPr>
+        <w:pStyle w:val="oancuaDanhsach"/>
         <w:spacing w:before="20" w:after="30" w:line="276" w:lineRule="auto"/>
+        <w:rPr>
+          <w:sz w:val="26"/>
+          <w:szCs w:val="26"/>
+        </w:rPr>
       </w:pPr>
       <w:r>
         <w:rPr>
           <w:rFonts w:ascii="Times New Roman" w:hAnsi="Times New Roman"/>
-          <w:sz w:val="20"/>
-        </w:rPr>
-        <w:t>1.4. Phân tích yêu cầu hệ thống (Yêu cầu phía người dùng và Yêu cầu phía quản lý)</w:t>
-      </w:r>
-    </w:p>
-    <w:p>
-      <w:pPr>
-        <w:pStyle w:val="ListParagraph"/>
+          <w:sz w:val="26"/>
+          <w:szCs w:val="26"/>
+        </w:rPr>
+        <w:t>2.4. Biểu đồ Use Case tổng quát và 6 Biểu đồ Use Case phân rã kèm Bảng đặc tả 8 mục chi tiết chuẩn Cockburn</w:t>
+      </w:r>
+    </w:p>
+    <w:p>
+      <w:pPr>
+        <w:pStyle w:val="oancuaDanhsach"/>
         <w:spacing w:before="20" w:after="30" w:line="276" w:lineRule="auto"/>
+        <w:rPr>
+          <w:sz w:val="26"/>
+          <w:szCs w:val="26"/>
+        </w:rPr>
       </w:pPr>
       <w:r>
         <w:rPr>
           <w:rFonts w:ascii="Times New Roman" w:hAnsi="Times New Roman"/>
-          <w:sz w:val="20"/>
-        </w:rPr>
-        <w:t>1.5. Phân tích chức năng hệ thống (Danh mục chức năng người dùng và Danh mục chức năng người quản trị)</w:t>
+          <w:sz w:val="26"/>
+          <w:szCs w:val="26"/>
+        </w:rPr>
+        <w:t>2.5. Biểu đồ tuần tự (Sequence Diagram) mô tả các luồng nghiệp vụ cốt lõi (Đăng nhập xác thực JWT, Xuất bản AI Copilot &amp; Facebook, Nộp báo cáo &amp; Chấm điểm thi đua 16 Tổ)</w:t>
       </w:r>
     </w:p>
     <w:p>
       <w:pPr>
         <w:spacing w:before="120" w:after="40"/>
-      </w:pPr>
-      <w:r>
-        <w:rPr>
-          <w:rFonts w:ascii="Times New Roman" w:hAnsi="Times New Roman"/>
+        <w:rPr>
+          <w:sz w:val="26"/>
+          <w:szCs w:val="26"/>
+        </w:rPr>
+      </w:pPr>
+      <w:r>
+        <w:rPr>
+          <w:rFonts w:ascii="Times New Roman" w:hAnsi="Times New Roman" w:cs="Times New Roman" w:eastAsia="Times New Roman"/>
           <w:b/>
-          <w:sz w:val="22"/>
-        </w:rPr>
-        <w:t>Chương 2: Phân tích và thiết kế hệ thống theo chuẩn UML</w:t>
-      </w:r>
-    </w:p>
-    <w:p>
-      <w:pPr>
-        <w:pStyle w:val="ListParagraph"/>
+          <w:sz w:val="26"/>
+        </w:rPr>
+        <w:t>Chương 3: Cơ sở dữ liệu và thiết kế, hiện thực hệ thống</w:t>
+      </w:r>
+    </w:p>
+    <w:p>
+      <w:pPr>
+        <w:pStyle w:val="oancuaDanhsach"/>
         <w:spacing w:before="20" w:after="30" w:line="276" w:lineRule="auto"/>
-      </w:pPr>
-      <w:r>
-        <w:rPr>
-          <w:rFonts w:ascii="Times New Roman" w:hAnsi="Times New Roman"/>
-          <w:sz w:val="20"/>
-        </w:rPr>
-        <w:t>2.1. Danh sách và cấu trúc phân cấp các Actor (4 Actor con người: Admin, Editor, Contributor, User + 3 Actor dịch vụ ngoài)</w:t>
-      </w:r>
-    </w:p>
-    <w:p>
-      <w:pPr>
-        <w:pStyle w:val="ListParagraph"/>
+        <w:rPr>
+          <w:sz w:val="26"/>
+          <w:szCs w:val="26"/>
+        </w:rPr>
+      </w:pPr>
+      <w:r>
+        <w:rPr>
+          <w:rFonts w:ascii="Times New Roman" w:hAnsi="Times New Roman" w:cs="Times New Roman" w:eastAsia="Times New Roman"/>
+          <w:b w:val="0"/>
+          <w:sz w:val="26"/>
+        </w:rPr>
+        <w:t>3.1. Sơ đồ thực thể liên kết (ERD) và Kiến trúc 3 tầng phân tán (React SPA - Express RESTful API - MSSQL Database)</w:t>
+      </w:r>
+    </w:p>
+    <w:p>
+      <w:pPr>
+        <w:pStyle w:val="oancuaDanhsach"/>
         <w:spacing w:before="20" w:after="30" w:line="276" w:lineRule="auto"/>
-      </w:pPr>
-      <w:r>
-        <w:rPr>
-          <w:rFonts w:ascii="Times New Roman" w:hAnsi="Times New Roman"/>
-          <w:sz w:val="20"/>
-        </w:rPr>
-        <w:t>2.2. Danh mục 26 Use Case chức năng hệ thống</w:t>
-      </w:r>
-    </w:p>
-    <w:p>
-      <w:pPr>
-        <w:pStyle w:val="ListParagraph"/>
+        <w:rPr>
+          <w:sz w:val="26"/>
+          <w:szCs w:val="26"/>
+        </w:rPr>
+      </w:pPr>
+      <w:r>
+        <w:rPr>
+          <w:rFonts w:ascii="Times New Roman" w:hAnsi="Times New Roman" w:cs="Times New Roman" w:eastAsia="Times New Roman"/>
+          <w:b w:val="0"/>
+          <w:sz w:val="26"/>
+        </w:rPr>
+        <w:t>3.2. Thiết kế và đặc tả chi tiết 15 bảng cơ sở dữ liệu quan hệ chuẩn hóa (ORGANIZATIONS, UNION_BRANCHES, MEMBERS, CATEGORIES, ARTICLES, DOCUMENTS, MONTHLY_REPORTS, SCHEDULES, USERS, ARTICLE_AUDITS, COMMENTS, BOOKMARKS, WELFARE_PROGRAMS, AID_REQUESTS, INBOX_FEEDBACK)</w:t>
+      </w:r>
+    </w:p>
+    <w:p>
+      <w:pPr>
+        <w:pStyle w:val="oancuaDanhsach"/>
         <w:spacing w:before="20" w:after="30" w:line="276" w:lineRule="auto"/>
-      </w:pPr>
-      <w:r>
-        <w:rPr>
-          <w:rFonts w:ascii="Times New Roman" w:hAnsi="Times New Roman"/>
-          <w:sz w:val="20"/>
-        </w:rPr>
-        <w:t>2.3. Ma trận quan hệ Use Case (&lt;&lt;include&gt;&gt;, &lt;&lt;extend&gt;&gt;) và Ma trận phân quyền CRUD</w:t>
-      </w:r>
-    </w:p>
-    <w:p>
-      <w:pPr>
-        <w:pStyle w:val="ListParagraph"/>
+        <w:rPr>
+          <w:sz w:val="26"/>
+          <w:szCs w:val="26"/>
+        </w:rPr>
+      </w:pPr>
+      <w:r>
+        <w:rPr>
+          <w:rFonts w:ascii="Times New Roman" w:hAnsi="Times New Roman" w:cs="Times New Roman" w:eastAsia="Times New Roman"/>
+          <w:b w:val="0"/>
+          <w:sz w:val="26"/>
+        </w:rPr>
+        <w:t>3.3. Thiết kế kiến trúc tích hợp Trợ lý AI (Google Gemini Pro/Flash API) và Meta Facebook Graph API v19.0</w:t>
+      </w:r>
+    </w:p>
+    <w:p>
+      <w:pPr>
+        <w:pStyle w:val="oancuaDanhsach"/>
+        <w:spacing w:before="120" w:after="40"/>
+        <w:rPr>
+          <w:sz w:val="26"/>
+          <w:szCs w:val="26"/>
+        </w:rPr>
+      </w:pPr>
+      <w:r>
+        <w:rPr>
+          <w:rFonts w:ascii="Times New Roman" w:hAnsi="Times New Roman" w:cs="Times New Roman" w:eastAsia="Times New Roman"/>
+          <w:b w:val="0"/>
+          <w:sz w:val="26"/>
+        </w:rPr>
+        <w:t>3.4. Hiện thực hệ thống, giao diện các phân hệ cốt lõi và kết quả thực nghiệm đa kênh tích hợp AI</w:t>
+      </w:r>
+    </w:p>
+    <w:p>
+      <w:pPr>
+        <w:pStyle w:val="oancuaDanhsach"/>
         <w:spacing w:before="20" w:after="30" w:line="276" w:lineRule="auto"/>
-      </w:pPr>
-      <w:r>
-        <w:rPr>
-          <w:rFonts w:ascii="Times New Roman" w:hAnsi="Times New Roman"/>
-          <w:sz w:val="20"/>
-        </w:rPr>
-        <w:t>2.4. Biểu đồ Use Case tổng quát và 6 Biểu đồ Use Case phân rã kèm Bảng đặc tả 8 mục chi tiết chuẩn Cockburn</w:t>
-      </w:r>
-    </w:p>
-    <w:p>
-      <w:pPr>
-        <w:pStyle w:val="ListParagraph"/>
-        <w:spacing w:before="20" w:after="30" w:line="276" w:lineRule="auto"/>
-      </w:pPr>
-      <w:r>
-        <w:rPr>
-          <w:rFonts w:ascii="Times New Roman" w:hAnsi="Times New Roman"/>
-          <w:sz w:val="20"/>
-        </w:rPr>
-        <w:t>2.5. Biểu đồ tuần tự (Sequence Diagram) mô tả các luồng nghiệp vụ cốt lõi (Đăng nhập xác thực JWT, Xuất bản AI Copilot &amp; Facebook, Nộp báo cáo &amp; Chấm điểm thi đua 16 Tổ)</w:t>
-      </w:r>
-    </w:p>
-    <w:p>
-      <w:pPr>
-        <w:spacing w:before="120" w:after="40"/>
-      </w:pPr>
-      <w:r>
-        <w:rPr>
-          <w:rFonts w:ascii="Times New Roman" w:hAnsi="Times New Roman"/>
-          <w:b/>
-          <w:sz w:val="22"/>
-        </w:rPr>
-        <w:t>Chương 3: Thiết kế cơ sở dữ liệu và kiến trúc phần mềm</w:t>
-      </w:r>
-    </w:p>
-    <w:p>
-      <w:pPr>
-        <w:pStyle w:val="ListParagraph"/>
-        <w:spacing w:before="20" w:after="30" w:line="276" w:lineRule="auto"/>
-      </w:pPr>
-      <w:r>
-        <w:rPr>
-          <w:rFonts w:ascii="Times New Roman" w:hAnsi="Times New Roman"/>
-          <w:sz w:val="20"/>
-        </w:rPr>
-        <w:t>3.1. Sơ đồ thực thể liên kết (ERD) và Kiến trúc 3 tầng phân tán (React SPA - Express RESTful API - MSSQL Database)</w:t>
-      </w:r>
-    </w:p>
-    <w:p>
-      <w:pPr>
-        <w:pStyle w:val="ListParagraph"/>
-        <w:spacing w:before="20" w:after="30" w:line="276" w:lineRule="auto"/>
-      </w:pPr>
-      <w:r>
-        <w:rPr>
-          <w:rFonts w:ascii="Times New Roman" w:hAnsi="Times New Roman"/>
-          <w:sz w:val="20"/>
-        </w:rPr>
-        <w:t>3.2. Thiết kế và đặc tả chi tiết 15 bảng cơ sở dữ liệu quan hệ chuẩn hóa (Users, Roles, Categories, Articles, History, Media, Comments, Reactions, FacebookLogs, AILogs, Branches, MonthlyReports, Scores, Feedback, Settings)</w:t>
-      </w:r>
-    </w:p>
-    <w:p>
-      <w:pPr>
-        <w:pStyle w:val="ListParagraph"/>
-        <w:spacing w:before="20" w:after="30" w:line="276" w:lineRule="auto"/>
-      </w:pPr>
-      <w:r>
-        <w:rPr>
-          <w:rFonts w:ascii="Times New Roman" w:hAnsi="Times New Roman"/>
-          <w:sz w:val="20"/>
-        </w:rPr>
-        <w:t>3.3. Thiết kế kiến trúc tích hợp Trợ lý AI (Google Gemini Pro/Flash API) và Meta Facebook Graph API v19.0</w:t>
-      </w:r>
-    </w:p>
-    <w:p>
-      <w:pPr>
-        <w:spacing w:before="120" w:after="40"/>
-      </w:pPr>
-      <w:r>
-        <w:rPr>
-          <w:rFonts w:ascii="Times New Roman" w:hAnsi="Times New Roman"/>
-          <w:b/>
-          <w:sz w:val="22"/>
-        </w:rPr>
-        <w:t>Chương 4: Hiện thực hệ thống và thực nghiệm đa kênh tích hợp AI</w:t>
-      </w:r>
-    </w:p>
-    <w:p>
-      <w:pPr>
-        <w:pStyle w:val="ListParagraph"/>
-        <w:spacing w:before="20" w:after="30" w:line="276" w:lineRule="auto"/>
-      </w:pPr>
-      <w:r>
-        <w:rPr>
-          <w:rFonts w:ascii="Times New Roman" w:hAnsi="Times New Roman"/>
-          <w:sz w:val="20"/>
-        </w:rPr>
-        <w:t>4.1. Môi trường cài đặt, cấu hình hệ thống và công nghệ triển khai (React 18, Node.js Express, MSSQL 2022)</w:t>
-      </w:r>
-    </w:p>
-    <w:p>
-      <w:pPr>
-        <w:pStyle w:val="ListParagraph"/>
-        <w:spacing w:before="20" w:after="30" w:line="276" w:lineRule="auto"/>
-      </w:pPr>
-      <w:r>
-        <w:rPr>
-          <w:rFonts w:ascii="Times New Roman" w:hAnsi="Times New Roman"/>
-          <w:sz w:val="20"/>
-        </w:rPr>
-        <w:t>4.2. Xây dựng các phân hệ giao diện người dùng và bảng điều khiển quản trị (Dashboard, Trợ lý AI CMS, Phân hệ thi đua 16 Tổ, Lập lịch xuất bản đa kênh)</w:t>
-      </w:r>
-    </w:p>
-    <w:p>
-      <w:pPr>
-        <w:pStyle w:val="ListParagraph"/>
-        <w:spacing w:before="20" w:after="30" w:line="276" w:lineRule="auto"/>
-      </w:pPr>
-      <w:r>
-        <w:rPr>
-          <w:rFonts w:ascii="Times New Roman" w:hAnsi="Times New Roman"/>
-          <w:sz w:val="20"/>
-        </w:rPr>
-        <w:t>4.3. Kiểm thử chức năng toàn diện (Functional Testing) và Đánh giá hiệu năng thực tế</w:t>
-      </w:r>
-    </w:p>
-    <w:p>
-      <w:pPr>
-        <w:spacing w:before="120" w:after="40"/>
-      </w:pPr>
-      <w:r>
-        <w:rPr>
-          <w:rFonts w:ascii="Times New Roman" w:hAnsi="Times New Roman"/>
-          <w:b/>
-          <w:sz w:val="22"/>
-        </w:rPr>
-        <w:t>Chương 5: Tổng kết, đánh giá và hướng phát triển</w:t>
-      </w:r>
-    </w:p>
-    <w:p>
-      <w:pPr>
-        <w:pStyle w:val="ListParagraph"/>
-        <w:spacing w:before="20" w:after="30" w:line="276" w:lineRule="auto"/>
-      </w:pPr>
-      <w:r>
-        <w:rPr>
-          <w:rFonts w:ascii="Times New Roman" w:hAnsi="Times New Roman"/>
-          <w:sz w:val="20"/>
-        </w:rPr>
-        <w:t>5.1. Kết quả đạt được so với mục tiêu đề tài</w:t>
-      </w:r>
-    </w:p>
-    <w:p>
-      <w:pPr>
-        <w:pStyle w:val="ListParagraph"/>
-        <w:spacing w:before="20" w:after="30" w:line="276" w:lineRule="auto"/>
-      </w:pPr>
-      <w:r>
-        <w:rPr>
-          <w:rFonts w:ascii="Times New Roman" w:hAnsi="Times New Roman"/>
-          <w:sz w:val="20"/>
-        </w:rPr>
-        <w:t>5.2. Đánh giá ưu điểm, hạn chế và bài học kinh nghiệm trong quá trình nghiên cứu, triển khai</w:t>
-      </w:r>
-    </w:p>
-    <w:p>
-      <w:pPr>
-        <w:pStyle w:val="ListParagraph"/>
-        <w:spacing w:before="20" w:after="30" w:line="276" w:lineRule="auto"/>
-      </w:pPr>
-      <w:r>
-        <w:rPr>
-          <w:rFonts w:ascii="Times New Roman" w:hAnsi="Times New Roman"/>
-          <w:sz w:val="20"/>
-        </w:rPr>
-        <w:t>5.3. Hướng phát triển mở rộng (tích hợp Zalo Official Account, Mobile App, Trí tuệ nhân tạo phân tích cảm xúc dư luận đoàn viên)</w:t>
-      </w:r>
-    </w:p>
-    <w:p>
-      <w:pPr>
-        <w:pStyle w:val="ListParagraph"/>
+        <w:rPr>
+          <w:sz w:val="26"/>
+          <w:szCs w:val="26"/>
+        </w:rPr>
+      </w:pPr>
+      <w:r>
+        <w:rPr>
+          <w:rFonts w:ascii="Times New Roman" w:hAnsi="Times New Roman" w:cs="Times New Roman" w:eastAsia="Times New Roman"/>
+          <w:b w:val="0"/>
+          <w:sz w:val="26"/>
+        </w:rPr>
+        <w:t>3.5. Đánh giá kết quả đạt được, kết luận và hướng phát triển đề tài (kết nối Zalo OA, Mobile App, AI phân tích cảm xúc phản hồi)</w:t>
+      </w:r>
+    </w:p>
+    <w:p>
+      <w:pPr>
+        <w:pStyle w:val="oancuaDanhsach"/>
         <w:numPr>
           <w:ilvl w:val="1"/>
           <w:numId w:val="1"/>
@@ -4102,7 +4126,7 @@
           <w:p>
             <w:pPr>
               <w:shd w:val="clear" w:color="auto" w:fill="FFFFFF" w:themeFill="background1"/>
-              <w:spacing w:line="276" w:lineRule="auto" w:before="40" w:after="40"/>
+              <w:spacing w:before="40" w:after="40" w:line="276" w:lineRule="auto"/>
               <w:contextualSpacing/>
               <w:jc w:val="center"/>
               <w:rPr>
@@ -4114,9 +4138,9 @@
             </w:pPr>
             <w:r>
               <w:rPr>
-                <w:rFonts w:ascii="Times New Roman" w:hAnsi="Times New Roman"/>
+                <w:rFonts w:ascii="Times New Roman" w:hAnsi="Times New Roman" w:cs="Times New Roman" w:eastAsia="Times New Roman"/>
                 <w:b/>
-                <w:sz w:val="20"/>
+                <w:sz w:val="22"/>
                 <w:szCs w:val="26"/>
                 <w:lang w:val="vi-VN"/>
               </w:rPr>
@@ -4132,7 +4156,7 @@
           <w:p>
             <w:pPr>
               <w:shd w:val="clear" w:color="auto" w:fill="FFFFFF" w:themeFill="background1"/>
-              <w:spacing w:line="276" w:lineRule="auto" w:before="40" w:after="40"/>
+              <w:spacing w:before="40" w:after="40" w:line="276" w:lineRule="auto"/>
               <w:contextualSpacing/>
               <w:jc w:val="center"/>
               <w:rPr>
@@ -4144,9 +4168,9 @@
             </w:pPr>
             <w:r>
               <w:rPr>
-                <w:rFonts w:ascii="Times New Roman" w:hAnsi="Times New Roman"/>
+                <w:rFonts w:ascii="Times New Roman" w:hAnsi="Times New Roman" w:cs="Times New Roman" w:eastAsia="Times New Roman"/>
                 <w:b/>
-                <w:sz w:val="20"/>
+                <w:sz w:val="22"/>
                 <w:szCs w:val="26"/>
                 <w:lang w:val="vi-VN"/>
               </w:rPr>
@@ -4162,7 +4186,7 @@
           <w:p>
             <w:pPr>
               <w:shd w:val="clear" w:color="auto" w:fill="FFFFFF" w:themeFill="background1"/>
-              <w:spacing w:line="276" w:lineRule="auto" w:before="40" w:after="40"/>
+              <w:spacing w:before="40" w:after="40" w:line="276" w:lineRule="auto"/>
               <w:contextualSpacing/>
               <w:jc w:val="center"/>
               <w:rPr>
@@ -4174,9 +4198,9 @@
             </w:pPr>
             <w:r>
               <w:rPr>
-                <w:rFonts w:ascii="Times New Roman" w:hAnsi="Times New Roman"/>
+                <w:rFonts w:ascii="Times New Roman" w:hAnsi="Times New Roman" w:cs="Times New Roman" w:eastAsia="Times New Roman"/>
                 <w:b/>
-                <w:sz w:val="20"/>
+                <w:sz w:val="22"/>
                 <w:szCs w:val="26"/>
                 <w:lang w:val="vi-VN"/>
               </w:rPr>
@@ -4186,7 +4210,7 @@
           <w:p>
             <w:pPr>
               <w:shd w:val="clear" w:color="auto" w:fill="FFFFFF" w:themeFill="background1"/>
-              <w:spacing w:line="276" w:lineRule="auto" w:before="40" w:after="40"/>
+              <w:spacing w:before="40" w:after="40" w:line="276" w:lineRule="auto"/>
               <w:contextualSpacing/>
               <w:jc w:val="center"/>
               <w:rPr>
@@ -4206,7 +4230,7 @@
           <w:p>
             <w:pPr>
               <w:shd w:val="clear" w:color="auto" w:fill="FFFFFF" w:themeFill="background1"/>
-              <w:spacing w:line="276" w:lineRule="auto" w:before="40" w:after="40"/>
+              <w:spacing w:before="40" w:after="40" w:line="276" w:lineRule="auto"/>
               <w:contextualSpacing/>
               <w:rPr>
                 <w:b/>
@@ -4217,9 +4241,9 @@
             </w:pPr>
             <w:r>
               <w:rPr>
-                <w:rFonts w:ascii="Times New Roman" w:hAnsi="Times New Roman"/>
+                <w:rFonts w:ascii="Times New Roman" w:hAnsi="Times New Roman" w:cs="Times New Roman" w:eastAsia="Times New Roman"/>
                 <w:b/>
-                <w:sz w:val="20"/>
+                <w:sz w:val="22"/>
                 <w:szCs w:val="26"/>
                 <w:lang w:val="vi-VN"/>
               </w:rPr>
@@ -4239,24 +4263,10 @@
             <w:vAlign w:val="center"/>
           </w:tcPr>
           <w:p>
-            <w:pPr>
-              <w:shd w:val="clear" w:color="auto" w:fill="FFFFFF" w:themeFill="background1"/>
-              <w:spacing w:line="276" w:lineRule="auto" w:before="40" w:after="40"/>
-              <w:contextualSpacing/>
-              <w:jc w:val="center"/>
-              <w:rPr>
-                <w:sz w:val="26"/>
-                <w:szCs w:val="26"/>
-                <w:lang w:val="vi-VN"/>
-              </w:rPr>
-            </w:pPr>
             <w:r>
               <w:rPr>
-                <w:rFonts w:ascii="Times New Roman" w:hAnsi="Times New Roman"/>
-                <w:color w:val="000000" w:themeColor="text1"/>
-                <w:sz w:val="20"/>
-                <w:szCs w:val="26"/>
-                <w:lang w:val="vi-VN"/>
+                <w:rFonts w:ascii="Times New Roman" w:hAnsi="Times New Roman" w:cs="Times New Roman" w:eastAsia="Times New Roman"/>
+                <w:sz w:val="22"/>
               </w:rPr>
               <w:t>1 tháng</w:t>
             </w:r>
@@ -4268,25 +4278,12 @@
             <w:vAlign w:val="center"/>
           </w:tcPr>
           <w:p>
-            <w:pPr>
-              <w:shd w:val="clear" w:color="auto" w:fill="FFFFFF" w:themeFill="background1"/>
-              <w:spacing w:line="276" w:lineRule="auto" w:before="40" w:after="40"/>
-              <w:contextualSpacing/>
-              <w:rPr>
-                <w:sz w:val="26"/>
-                <w:szCs w:val="26"/>
-                <w:lang w:val="vi-VN"/>
-              </w:rPr>
-            </w:pPr>
             <w:r>
               <w:rPr>
-                <w:rFonts w:ascii="Times New Roman" w:hAnsi="Times New Roman"/>
-                <w:color w:val="000000" w:themeColor="text1"/>
-                <w:sz w:val="20"/>
-                <w:szCs w:val="26"/>
-                <w:lang w:val="vi-VN"/>
+                <w:rFonts w:ascii="Times New Roman" w:hAnsi="Times New Roman" w:cs="Times New Roman" w:eastAsia="Times New Roman"/>
+                <w:sz w:val="22"/>
               </w:rPr>
-              <w:t>Khảo sát thực trạng, phân tích yêu cầu và thực hiện Chương 1 (Tổng quan)</w:t>
+              <w:t>Khảo sát thực trạng truyền thông Công đoàn TDMU, khảo sát phần cứng hạ tầng, phân tích yêu cầu, phân tích chức năng và thực hiện Chương 1 (Tổng quan và khảo sát hiện trạng)</w:t>
             </w:r>
           </w:p>
         </w:tc>
@@ -4296,23 +4293,10 @@
             <w:vAlign w:val="center"/>
           </w:tcPr>
           <w:p>
-            <w:pPr>
-              <w:shd w:val="clear" w:color="auto" w:fill="FFFFFF" w:themeFill="background1"/>
-              <w:spacing w:line="276" w:lineRule="auto" w:before="40" w:after="40"/>
-              <w:contextualSpacing/>
-              <w:rPr>
-                <w:sz w:val="26"/>
-                <w:szCs w:val="26"/>
-                <w:lang w:val="vi-VN"/>
-              </w:rPr>
-            </w:pPr>
             <w:r>
               <w:rPr>
-                <w:rFonts w:ascii="Times New Roman" w:hAnsi="Times New Roman"/>
-                <w:color w:val="000000" w:themeColor="text1"/>
-                <w:sz w:val="20"/>
-                <w:szCs w:val="26"/>
-                <w:lang w:val="vi-VN"/>
+                <w:rFonts w:ascii="Times New Roman" w:hAnsi="Times New Roman" w:cs="Times New Roman" w:eastAsia="Times New Roman"/>
+                <w:sz w:val="22"/>
               </w:rPr>
               <w:t>Đề cương chi tiết và nội dung báo cáo Chương 1</w:t>
             </w:r>
@@ -4324,26 +4308,10 @@
             <w:vAlign w:val="center"/>
           </w:tcPr>
           <w:p>
-            <w:pPr>
-              <w:shd w:val="clear" w:color="auto" w:fill="FFFFFF" w:themeFill="background1"/>
-              <w:spacing w:line="276" w:lineRule="auto" w:before="40" w:after="40"/>
-              <w:contextualSpacing/>
-              <w:rPr>
-                <w:bCs/>
-                <w:color w:val="000000" w:themeColor="text1"/>
-                <w:sz w:val="26"/>
-                <w:szCs w:val="26"/>
-                <w:lang w:val="vi-VN"/>
-              </w:rPr>
-            </w:pPr>
             <w:r>
               <w:rPr>
-                <w:rFonts w:ascii="Times New Roman" w:hAnsi="Times New Roman"/>
-                <w:bCs/>
-                <w:color w:val="000000" w:themeColor="text1"/>
-                <w:sz w:val="20"/>
-                <w:szCs w:val="26"/>
-                <w:lang w:val="vi-VN"/>
+                <w:rFonts w:ascii="Times New Roman" w:hAnsi="Times New Roman" w:cs="Times New Roman" w:eastAsia="Times New Roman"/>
+                <w:sz w:val="22"/>
               </w:rPr>
               <w:t>Trần Hồng Thanh</w:t>
             </w:r>
@@ -4361,24 +4329,10 @@
             <w:vAlign w:val="center"/>
           </w:tcPr>
           <w:p>
-            <w:pPr>
-              <w:shd w:val="clear" w:color="auto" w:fill="FFFFFF" w:themeFill="background1"/>
-              <w:spacing w:line="276" w:lineRule="auto" w:before="40" w:after="40"/>
-              <w:contextualSpacing/>
-              <w:jc w:val="center"/>
-              <w:rPr>
-                <w:sz w:val="26"/>
-                <w:szCs w:val="26"/>
-                <w:lang w:val="vi-VN"/>
-              </w:rPr>
-            </w:pPr>
             <w:r>
               <w:rPr>
-                <w:rFonts w:ascii="Times New Roman" w:hAnsi="Times New Roman"/>
-                <w:color w:val="000000" w:themeColor="text1"/>
-                <w:sz w:val="20"/>
-                <w:szCs w:val="26"/>
-                <w:lang w:val="vi-VN"/>
+                <w:rFonts w:ascii="Times New Roman" w:hAnsi="Times New Roman" w:cs="Times New Roman" w:eastAsia="Times New Roman"/>
+                <w:sz w:val="22"/>
               </w:rPr>
               <w:t>1 tháng</w:t>
             </w:r>
@@ -4390,15 +4344,12 @@
             <w:vAlign w:val="center"/>
           </w:tcPr>
           <w:p>
-            <w:pPr>
-              <w:spacing w:before="40" w:after="40" w:line="276" w:lineRule="auto"/>
-            </w:pPr>
             <w:r>
               <w:rPr>
-                <w:rFonts w:ascii="Times New Roman" w:hAnsi="Times New Roman"/>
-                <w:sz w:val="20"/>
+                <w:rFonts w:ascii="Times New Roman" w:hAnsi="Times New Roman" w:cs="Times New Roman" w:eastAsia="Times New Roman"/>
+                <w:sz w:val="22"/>
               </w:rPr>
-              <w:t>Phân tích, thiết kế hệ thống theo chuẩn UML (Chương 2), thiết kế CSDL 15 bảng MSSQL và kiến trúc 3 tầng (Chương 3), thiết kế giao diện trên Figma</w:t>
+              <w:t>Phân tích hệ thống theo chuẩn UML (phân cấp 4 Actor, 26 Use Case, ma trận quan hệ/CRUD, biểu đồ Use Case tổng quát/phân rã và Biểu đồ tuần tự) phục vụ Chương 2; Thiết kế giao diện Figma (UI/UX)</w:t>
             </w:r>
           </w:p>
         </w:tc>
@@ -4408,15 +4359,12 @@
             <w:vAlign w:val="center"/>
           </w:tcPr>
           <w:p>
-            <w:pPr>
-              <w:spacing w:before="40" w:after="40" w:line="276" w:lineRule="auto"/>
-            </w:pPr>
             <w:r>
               <w:rPr>
-                <w:rFonts w:ascii="Times New Roman" w:hAnsi="Times New Roman"/>
-                <w:sz w:val="20"/>
+                <w:rFonts w:ascii="Times New Roman" w:hAnsi="Times New Roman" w:cs="Times New Roman" w:eastAsia="Times New Roman"/>
+                <w:sz w:val="22"/>
               </w:rPr>
-              <w:t>Sơ đồ Use Case, Sequence Diagram, Sơ đồ ERD 15 bảng CSDL và bản thiết kế giao diện Figma (UI/UX)</w:t>
+              <w:t>Tập biểu đồ UML phân tích hệ thống và bộ thiết kế giao diện Figma UI/UX hoàn chỉnh</w:t>
             </w:r>
           </w:p>
         </w:tc>
@@ -4426,48 +4374,13 @@
             <w:vAlign w:val="center"/>
           </w:tcPr>
           <w:p>
-            <w:pPr>
-              <w:shd w:val="clear" w:color="auto" w:fill="FFFFFF" w:themeFill="background1"/>
-              <w:spacing w:line="276" w:lineRule="auto" w:before="40" w:after="40"/>
-              <w:contextualSpacing/>
-              <w:rPr>
-                <w:color w:val="000000" w:themeColor="text1"/>
-                <w:sz w:val="26"/>
-                <w:szCs w:val="26"/>
-                <w:lang w:val="vi-VN"/>
-              </w:rPr>
-            </w:pPr>
             <w:r>
               <w:rPr>
-                <w:rFonts w:ascii="Times New Roman" w:hAnsi="Times New Roman"/>
-                <w:color w:val="000000" w:themeColor="text1"/>
-                <w:sz w:val="20"/>
-                <w:szCs w:val="26"/>
-                <w:lang w:val="vi-VN"/>
+                <w:rFonts w:ascii="Times New Roman" w:hAnsi="Times New Roman" w:cs="Times New Roman" w:eastAsia="Times New Roman"/>
+                <w:sz w:val="22"/>
               </w:rPr>
               <w:t>Nguyễn Bình Dương</w:t>
-            </w:r>
-          </w:p>
-          <w:p>
-            <w:pPr>
-              <w:shd w:val="clear" w:color="auto" w:fill="FFFFFF" w:themeFill="background1"/>
-              <w:spacing w:line="276" w:lineRule="auto" w:before="40" w:after="40"/>
-              <w:contextualSpacing/>
-              <w:rPr>
-                <w:color w:val="000000" w:themeColor="text1"/>
-                <w:sz w:val="26"/>
-                <w:szCs w:val="26"/>
-                <w:lang w:val="vi-VN"/>
-              </w:rPr>
-            </w:pPr>
-            <w:r>
-              <w:rPr>
-                <w:rFonts w:ascii="Times New Roman" w:hAnsi="Times New Roman"/>
-                <w:color w:val="000000" w:themeColor="text1"/>
-                <w:sz w:val="20"/>
-                <w:szCs w:val="26"/>
-                <w:lang w:val="vi-VN"/>
-              </w:rPr>
+              <w:br/>
               <w:t>Phạm Anh Tuấn</w:t>
             </w:r>
           </w:p>
@@ -4484,24 +4397,10 @@
             <w:vAlign w:val="center"/>
           </w:tcPr>
           <w:p>
-            <w:pPr>
-              <w:shd w:val="clear" w:color="auto" w:fill="FFFFFF" w:themeFill="background1"/>
-              <w:spacing w:line="276" w:lineRule="auto" w:before="40" w:after="40"/>
-              <w:contextualSpacing/>
-              <w:jc w:val="center"/>
-              <w:rPr>
-                <w:sz w:val="26"/>
-                <w:szCs w:val="26"/>
-                <w:lang w:val="vi-VN"/>
-              </w:rPr>
-            </w:pPr>
             <w:r>
               <w:rPr>
-                <w:rFonts w:ascii="Times New Roman" w:hAnsi="Times New Roman"/>
-                <w:color w:val="000000" w:themeColor="text1"/>
-                <w:sz w:val="20"/>
-                <w:szCs w:val="26"/>
-                <w:lang w:val="vi-VN"/>
+                <w:rFonts w:ascii="Times New Roman" w:hAnsi="Times New Roman" w:cs="Times New Roman" w:eastAsia="Times New Roman"/>
+                <w:sz w:val="22"/>
               </w:rPr>
               <w:t>2 tháng</w:t>
             </w:r>
@@ -4513,15 +4412,12 @@
             <w:vAlign w:val="center"/>
           </w:tcPr>
           <w:p>
-            <w:pPr>
-              <w:spacing w:before="40" w:after="40" w:line="276" w:lineRule="auto"/>
-            </w:pPr>
             <w:r>
               <w:rPr>
-                <w:rFonts w:ascii="Times New Roman" w:hAnsi="Times New Roman"/>
-                <w:sz w:val="20"/>
+                <w:rFonts w:ascii="Times New Roman" w:hAnsi="Times New Roman" w:cs="Times New Roman" w:eastAsia="Times New Roman"/>
+                <w:sz w:val="22"/>
               </w:rPr>
-              <w:t>Xây dựng ứng dụng hoàn chỉnh: Frontend React SPA, Backend Node.js Express, Tích hợp Gemini AI, Phân hệ thi đua 16 Tổ, Lập lịch xuất bản và kết nối Facebook Graph API</w:t>
+              <w:t>Thiết kế CSDL 15 bảng MSSQL, kiến trúc 3 tầng, hiện thực hệ thống (Frontend React SPA, Backend Node.js Express, Tích hợp Trợ lý Gemini AI, Facebook Graph API, phân hệ thi đua 16 Tổ) phục vụ Chương 3</w:t>
             </w:r>
           </w:p>
         </w:tc>
@@ -4531,15 +4427,12 @@
             <w:vAlign w:val="center"/>
           </w:tcPr>
           <w:p>
-            <w:pPr>
-              <w:spacing w:before="40" w:after="40" w:line="276" w:lineRule="auto"/>
-            </w:pPr>
             <w:r>
               <w:rPr>
-                <w:rFonts w:ascii="Times New Roman" w:hAnsi="Times New Roman"/>
-                <w:sz w:val="20"/>
+                <w:rFonts w:ascii="Times New Roman" w:hAnsi="Times New Roman" w:cs="Times New Roman" w:eastAsia="Times New Roman"/>
+                <w:sz w:val="22"/>
               </w:rPr>
-              <w:t>Website chạy thử nghiệm hoàn chỉnh 6 phân hệ (bản beta)</w:t>
+              <w:t>Mã nguồn hệ thống, CSDL MSSQL và Website chạy thử nghiệm hoàn chỉnh 6 phân hệ (bản beta)</w:t>
             </w:r>
           </w:p>
         </w:tc>
@@ -4549,51 +4442,13 @@
             <w:vAlign w:val="center"/>
           </w:tcPr>
           <w:p>
-            <w:pPr>
-              <w:shd w:val="clear" w:color="auto" w:fill="FFFFFF" w:themeFill="background1"/>
-              <w:spacing w:line="276" w:lineRule="auto" w:before="40" w:after="40"/>
-              <w:contextualSpacing/>
-              <w:rPr>
-                <w:bCs/>
-                <w:color w:val="000000" w:themeColor="text1"/>
-                <w:sz w:val="26"/>
-                <w:szCs w:val="26"/>
-                <w:lang w:val="vi-VN"/>
-              </w:rPr>
-            </w:pPr>
             <w:r>
               <w:rPr>
-                <w:rFonts w:ascii="Times New Roman" w:hAnsi="Times New Roman"/>
-                <w:bCs/>
-                <w:color w:val="000000" w:themeColor="text1"/>
-                <w:sz w:val="20"/>
-                <w:szCs w:val="26"/>
-                <w:lang w:val="vi-VN"/>
+                <w:rFonts w:ascii="Times New Roman" w:hAnsi="Times New Roman" w:cs="Times New Roman" w:eastAsia="Times New Roman"/>
+                <w:sz w:val="22"/>
               </w:rPr>
               <w:t>Nguyễn Bình Dương</w:t>
-            </w:r>
-          </w:p>
-          <w:p>
-            <w:pPr>
-              <w:shd w:val="clear" w:color="auto" w:fill="FFFFFF" w:themeFill="background1"/>
-              <w:spacing w:line="276" w:lineRule="auto" w:before="40" w:after="40"/>
-              <w:contextualSpacing/>
-              <w:rPr>
-                <w:color w:val="000000" w:themeColor="text1"/>
-                <w:sz w:val="26"/>
-                <w:szCs w:val="26"/>
-                <w:lang w:val="vi-VN"/>
-              </w:rPr>
-            </w:pPr>
-            <w:r>
-              <w:rPr>
-                <w:rFonts w:ascii="Times New Roman" w:hAnsi="Times New Roman"/>
-                <w:bCs/>
-                <w:color w:val="000000" w:themeColor="text1"/>
-                <w:sz w:val="20"/>
-                <w:szCs w:val="26"/>
-                <w:lang w:val="vi-VN"/>
-              </w:rPr>
+              <w:br/>
               <w:t>Trần Hồng Thanh</w:t>
             </w:r>
           </w:p>
@@ -4610,26 +4465,11 @@
             <w:vAlign w:val="center"/>
           </w:tcPr>
           <w:p>
-            <w:pPr>
-              <w:shd w:val="clear" w:color="auto" w:fill="FFFFFF" w:themeFill="background1"/>
-              <w:spacing w:line="276" w:lineRule="auto" w:before="40" w:after="40"/>
-              <w:contextualSpacing/>
-              <w:jc w:val="center"/>
-              <w:rPr>
-                <w:sz w:val="26"/>
-                <w:szCs w:val="26"/>
-                <w:lang w:val="vi-VN"/>
-              </w:rPr>
-            </w:pPr>
             <w:r>
               <w:rPr>
-                <w:rFonts w:ascii="Times New Roman" w:hAnsi="Times New Roman"/>
-                <w:color w:val="000000" w:themeColor="text1"/>
-                <w:sz w:val="20"/>
-                <w:szCs w:val="26"/>
-                <w:lang w:val="vi-VN"/>
+                <w:rFonts w:ascii="Times New Roman" w:hAnsi="Times New Roman" w:cs="Times New Roman" w:eastAsia="Times New Roman"/>
+                <w:sz w:val="22"/>
               </w:rPr>
-              <w:lastRenderedPageBreak/>
               <w:t>1 tháng</w:t>
             </w:r>
           </w:p>
@@ -4640,15 +4480,12 @@
             <w:vAlign w:val="center"/>
           </w:tcPr>
           <w:p>
-            <w:pPr>
-              <w:spacing w:before="40" w:after="40" w:line="276" w:lineRule="auto"/>
-            </w:pPr>
             <w:r>
               <w:rPr>
-                <w:rFonts w:ascii="Times New Roman" w:hAnsi="Times New Roman"/>
-                <w:sz w:val="20"/>
+                <w:rFonts w:ascii="Times New Roman" w:hAnsi="Times New Roman" w:cs="Times New Roman" w:eastAsia="Times New Roman"/>
+                <w:sz w:val="22"/>
               </w:rPr>
-              <w:t>Kiểm thử chức năng toàn diện 6 phân hệ, đánh giá hiệu năng và hoàn thiện báo cáo đề tài (Chương 4, Chương 5)</w:t>
+              <w:t>Kiểm thử chức năng toàn diện 6 phân hệ, đánh giá hiệu năng thực tế, tổng kết kết quả thực nghiệm và hoàn thiện cuốn báo cáo đề tài Chương 3</w:t>
             </w:r>
           </w:p>
         </w:tc>
@@ -4658,15 +4495,12 @@
             <w:vAlign w:val="center"/>
           </w:tcPr>
           <w:p>
-            <w:pPr>
-              <w:spacing w:before="40" w:after="40" w:line="276" w:lineRule="auto"/>
-            </w:pPr>
             <w:r>
               <w:rPr>
-                <w:rFonts w:ascii="Times New Roman" w:hAnsi="Times New Roman"/>
-                <w:sz w:val="20"/>
+                <w:rFonts w:ascii="Times New Roman" w:hAnsi="Times New Roman" w:cs="Times New Roman" w:eastAsia="Times New Roman"/>
+                <w:sz w:val="22"/>
               </w:rPr>
-              <w:t>Báo cáo kiểm thử và Cuốn báo cáo hoàn chỉnh</w:t>
+              <w:t>Báo cáo kiểm thử hệ thống và Cuốn báo cáo NCKH hoàn chỉnh 3 chương</w:t>
             </w:r>
           </w:p>
         </w:tc>
@@ -4676,24 +4510,10 @@
             <w:vAlign w:val="center"/>
           </w:tcPr>
           <w:p>
-            <w:pPr>
-              <w:shd w:val="clear" w:color="auto" w:fill="FFFFFF" w:themeFill="background1"/>
-              <w:spacing w:line="276" w:lineRule="auto" w:before="40" w:after="40"/>
-              <w:contextualSpacing/>
-              <w:rPr>
-                <w:color w:val="000000" w:themeColor="text1"/>
-                <w:sz w:val="26"/>
-                <w:szCs w:val="26"/>
-                <w:lang w:val="vi-VN"/>
-              </w:rPr>
-            </w:pPr>
             <w:r>
               <w:rPr>
-                <w:rFonts w:ascii="Times New Roman" w:hAnsi="Times New Roman"/>
-                <w:color w:val="000000" w:themeColor="text1"/>
-                <w:sz w:val="20"/>
-                <w:szCs w:val="26"/>
-                <w:lang w:val="vi-VN"/>
+                <w:rFonts w:ascii="Times New Roman" w:hAnsi="Times New Roman" w:cs="Times New Roman" w:eastAsia="Times New Roman"/>
+                <w:sz w:val="22"/>
               </w:rPr>
               <w:t>Phạm Anh Tuấn</w:t>
             </w:r>
@@ -4711,24 +4531,10 @@
             <w:vAlign w:val="center"/>
           </w:tcPr>
           <w:p>
-            <w:pPr>
-              <w:shd w:val="clear" w:color="auto" w:fill="FFFFFF" w:themeFill="background1"/>
-              <w:spacing w:line="276" w:lineRule="auto" w:before="40" w:after="40"/>
-              <w:contextualSpacing/>
-              <w:jc w:val="center"/>
-              <w:rPr>
-                <w:sz w:val="26"/>
-                <w:szCs w:val="26"/>
-                <w:lang w:val="vi-VN"/>
-              </w:rPr>
-            </w:pPr>
             <w:r>
               <w:rPr>
-                <w:rFonts w:ascii="Times New Roman" w:hAnsi="Times New Roman"/>
-                <w:color w:val="000000" w:themeColor="text1"/>
-                <w:sz w:val="20"/>
-                <w:szCs w:val="26"/>
-                <w:lang w:val="vi-VN"/>
+                <w:rFonts w:ascii="Times New Roman" w:hAnsi="Times New Roman" w:cs="Times New Roman" w:eastAsia="Times New Roman"/>
+                <w:sz w:val="22"/>
               </w:rPr>
               <w:t>1 tháng</w:t>
             </w:r>
@@ -4740,25 +4546,12 @@
             <w:vAlign w:val="center"/>
           </w:tcPr>
           <w:p>
-            <w:pPr>
-              <w:shd w:val="clear" w:color="auto" w:fill="FFFFFF" w:themeFill="background1"/>
-              <w:spacing w:line="276" w:lineRule="auto" w:before="40" w:after="40"/>
-              <w:contextualSpacing/>
-              <w:rPr>
-                <w:sz w:val="26"/>
-                <w:szCs w:val="26"/>
-                <w:lang w:val="vi-VN"/>
-              </w:rPr>
-            </w:pPr>
             <w:r>
               <w:rPr>
-                <w:rFonts w:ascii="Times New Roman" w:hAnsi="Times New Roman"/>
-                <w:color w:val="000000" w:themeColor="text1"/>
-                <w:sz w:val="20"/>
-                <w:szCs w:val="26"/>
-                <w:lang w:val="vi-VN"/>
+                <w:rFonts w:ascii="Times New Roman" w:hAnsi="Times New Roman" w:cs="Times New Roman" w:eastAsia="Times New Roman"/>
+                <w:sz w:val="22"/>
               </w:rPr>
-              <w:t>Triển khai thử nghiệm thực tế cho hoạt động truyền thông của Công đoàn TDMU</w:t>
+              <w:t>Triển khai thử nghiệm thực tế cho hoạt động truyền thông của Công đoàn TDMU, thu thập phản hồi của cán bộ đoàn viên và nghiệm thu đề tài</w:t>
             </w:r>
           </w:p>
         </w:tc>
@@ -4768,38 +4561,13 @@
             <w:vAlign w:val="center"/>
           </w:tcPr>
           <w:p>
-            <w:pPr>
-              <w:shd w:val="clear" w:color="auto" w:fill="FFFFFF" w:themeFill="background1"/>
-              <w:spacing w:line="276" w:lineRule="auto" w:before="40" w:after="40"/>
-              <w:contextualSpacing/>
-              <w:rPr>
-                <w:sz w:val="26"/>
-                <w:szCs w:val="26"/>
-                <w:lang w:val="vi-VN"/>
-              </w:rPr>
-            </w:pPr>
             <w:r>
               <w:rPr>
-                <w:rFonts w:ascii="Times New Roman" w:hAnsi="Times New Roman"/>
-                <w:color w:val="000000" w:themeColor="text1"/>
-                <w:sz w:val="20"/>
-                <w:szCs w:val="26"/>
-                <w:lang w:val="vi-VN"/>
+                <w:rFonts w:ascii="Times New Roman" w:hAnsi="Times New Roman" w:cs="Times New Roman" w:eastAsia="Times New Roman"/>
+                <w:sz w:val="22"/>
               </w:rPr>
-              <w:t>Kết quả phản hồi từ cán bộ phụ trách truyền thông Công đoàn TDMU và bản hoàn thiện hệ thống</w:t>
+              <w:t>Biên bản nghiệm thu thử nghiệm thực tế, kết quả đánh giá của Công đoàn TDMU và hồ sơ nghiệm thu</w:t>
             </w:r>
-          </w:p>
-          <w:p>
-            <w:pPr>
-              <w:shd w:val="clear" w:color="auto" w:fill="FFFFFF" w:themeFill="background1"/>
-              <w:spacing w:line="276" w:lineRule="auto" w:before="40" w:after="40"/>
-              <w:contextualSpacing/>
-              <w:rPr>
-                <w:sz w:val="26"/>
-                <w:szCs w:val="26"/>
-                <w:lang w:val="vi-VN"/>
-              </w:rPr>
-            </w:pPr>
           </w:p>
         </w:tc>
         <w:tc>
@@ -4808,52 +4576,13 @@
             <w:vAlign w:val="center"/>
           </w:tcPr>
           <w:p>
-            <w:pPr>
-              <w:shd w:val="clear" w:color="auto" w:fill="FFFFFF" w:themeFill="background1"/>
-              <w:spacing w:line="276" w:lineRule="auto" w:before="40" w:after="40"/>
-              <w:contextualSpacing/>
-              <w:rPr>
-                <w:bCs/>
-                <w:color w:val="000000" w:themeColor="text1"/>
-                <w:sz w:val="26"/>
-                <w:szCs w:val="26"/>
-                <w:lang w:val="vi-VN"/>
-              </w:rPr>
-            </w:pPr>
             <w:r>
               <w:rPr>
-                <w:rFonts w:ascii="Times New Roman" w:hAnsi="Times New Roman"/>
-                <w:bCs/>
-                <w:color w:val="000000" w:themeColor="text1"/>
-                <w:sz w:val="20"/>
-                <w:szCs w:val="26"/>
-                <w:lang w:val="vi-VN"/>
+                <w:rFonts w:ascii="Times New Roman" w:hAnsi="Times New Roman" w:cs="Times New Roman" w:eastAsia="Times New Roman"/>
+                <w:sz w:val="22"/>
               </w:rPr>
               <w:t>Nguyễn Bình Dương</w:t>
-            </w:r>
-          </w:p>
-          <w:p>
-            <w:pPr>
-              <w:shd w:val="clear" w:color="auto" w:fill="FFFFFF" w:themeFill="background1"/>
-              <w:spacing w:line="276" w:lineRule="auto" w:before="40" w:after="40"/>
-              <w:contextualSpacing/>
-              <w:rPr>
-                <w:bCs/>
-                <w:color w:val="000000" w:themeColor="text1"/>
-                <w:sz w:val="26"/>
-                <w:szCs w:val="26"/>
-                <w:lang w:val="vi-VN"/>
-              </w:rPr>
-            </w:pPr>
-            <w:r>
-              <w:rPr>
-                <w:rFonts w:ascii="Times New Roman" w:hAnsi="Times New Roman"/>
-                <w:bCs/>
-                <w:color w:val="000000" w:themeColor="text1"/>
-                <w:sz w:val="20"/>
-                <w:szCs w:val="26"/>
-                <w:lang w:val="vi-VN"/>
-              </w:rPr>
+              <w:br/>
               <w:t>Trần Hồng Thanh</w:t>
             </w:r>
           </w:p>
@@ -4870,13 +4599,12 @@
           <w:bCs/>
           <w:sz w:val="26"/>
           <w:szCs w:val="26"/>
-          <w:lang w:val="vi-VN"/>
-        </w:rPr>
-      </w:pPr>
-    </w:p>
-    <w:p>
-      <w:pPr>
-        <w:pStyle w:val="ListParagraph"/>
+        </w:rPr>
+      </w:pPr>
+    </w:p>
+    <w:p>
+      <w:pPr>
+        <w:pStyle w:val="oancuaDanhsach"/>
         <w:numPr>
           <w:ilvl w:val="0"/>
           <w:numId w:val="1"/>
@@ -4958,7 +4686,7 @@
     </w:p>
     <w:p>
       <w:pPr>
-        <w:pStyle w:val="ListParagraph"/>
+        <w:pStyle w:val="oancuaDanhsach"/>
         <w:numPr>
           <w:ilvl w:val="0"/>
           <w:numId w:val="18"/>
@@ -4977,136 +4705,15 @@
         </w:rPr>
       </w:pPr>
       <w:r>
+        <w:rPr>
+          <w:lang w:val="vi-VN"/>
+        </w:rPr>
         <w:t>Quản trị viên (Ban Chấp hành Công đoàn): Quản lý tài khoản, phân quyền RBAC 4 vai trò, quản lý cơ cấu 16 Tổ công đoàn, cấu hình API Keys (AI, Facebook, Mail), duyệt bài, giám sát định mức Token AI và nhật ký kiểm toán.</w:t>
       </w:r>
     </w:p>
     <w:p>
       <w:pPr>
-        <w:pStyle w:val="ListParagraph"/>
-        <w:numPr>
-          <w:ilvl w:val="0"/>
-          <w:numId w:val="19"/>
-        </w:numPr>
-        <w:shd w:val="clear" w:color="auto" w:fill="FFFFFF" w:themeFill="background1"/>
-        <w:spacing w:line="276" w:lineRule="auto"/>
-        <w:jc w:val="both"/>
-        <w:rPr>
-          <w:rFonts w:ascii="Times New Roman" w:hAnsi="Times New Roman"/>
-          <w:bCs/>
-          <w:color w:val="000000" w:themeColor="text1"/>
-          <w:sz w:val="26"/>
-          <w:szCs w:val="26"/>
-          <w:lang w:val="vi-VN"/>
-        </w:rPr>
-      </w:pPr>
-      <w:r>
-        <w:rPr>
-          <w:rFonts w:ascii="Times New Roman" w:hAnsi="Times New Roman"/>
-          <w:bCs/>
-          <w:color w:val="000000" w:themeColor="text1"/>
-          <w:sz w:val="26"/>
-          <w:szCs w:val="26"/>
-          <w:lang w:val="vi-VN"/>
-        </w:rPr>
-        <w:t>Quản lý tài khoản, phân quyền người dùng (Admin, Biên tập viên).</w:t>
-      </w:r>
-    </w:p>
-    <w:p>
-      <w:pPr>
-        <w:pStyle w:val="ListParagraph"/>
-        <w:numPr>
-          <w:ilvl w:val="0"/>
-          <w:numId w:val="19"/>
-        </w:numPr>
-        <w:shd w:val="clear" w:color="auto" w:fill="FFFFFF" w:themeFill="background1"/>
-        <w:spacing w:line="276" w:lineRule="auto"/>
-        <w:jc w:val="both"/>
-        <w:rPr>
-          <w:rFonts w:ascii="Times New Roman" w:hAnsi="Times New Roman"/>
-          <w:bCs/>
-          <w:color w:val="000000" w:themeColor="text1"/>
-          <w:sz w:val="26"/>
-          <w:szCs w:val="26"/>
-          <w:lang w:val="vi-VN"/>
-        </w:rPr>
-      </w:pPr>
-      <w:r>
-        <w:rPr>
-          <w:rFonts w:ascii="Times New Roman" w:hAnsi="Times New Roman"/>
-          <w:bCs/>
-          <w:color w:val="000000" w:themeColor="text1"/>
-          <w:sz w:val="26"/>
-          <w:szCs w:val="26"/>
-          <w:lang w:val="vi-VN"/>
-        </w:rPr>
-        <w:t>Duyệt/từ chối bài viết trước khi đăng tải công khai.</w:t>
-      </w:r>
-    </w:p>
-    <w:p>
-      <w:pPr>
-        <w:pStyle w:val="ListParagraph"/>
-        <w:numPr>
-          <w:ilvl w:val="0"/>
-          <w:numId w:val="19"/>
-        </w:numPr>
-        <w:shd w:val="clear" w:color="auto" w:fill="FFFFFF" w:themeFill="background1"/>
-        <w:spacing w:line="276" w:lineRule="auto"/>
-        <w:jc w:val="both"/>
-        <w:rPr>
-          <w:rFonts w:ascii="Times New Roman" w:hAnsi="Times New Roman"/>
-          <w:bCs/>
-          <w:color w:val="000000" w:themeColor="text1"/>
-          <w:sz w:val="26"/>
-          <w:szCs w:val="26"/>
-          <w:lang w:val="vi-VN"/>
-        </w:rPr>
-      </w:pPr>
-      <w:r>
-        <w:rPr>
-          <w:rFonts w:ascii="Times New Roman" w:hAnsi="Times New Roman"/>
-          <w:bCs/>
-          <w:color w:val="000000" w:themeColor="text1"/>
-          <w:sz w:val="26"/>
-          <w:szCs w:val="26"/>
-          <w:lang w:val="vi-VN"/>
-        </w:rPr>
-        <w:t>Quản lý danh mục nội dung truyền thông.</w:t>
-      </w:r>
-    </w:p>
-    <w:p>
-      <w:pPr>
-        <w:pStyle w:val="ListParagraph"/>
-        <w:numPr>
-          <w:ilvl w:val="0"/>
-          <w:numId w:val="19"/>
-        </w:numPr>
-        <w:shd w:val="clear" w:color="auto" w:fill="FFFFFF" w:themeFill="background1"/>
-        <w:spacing w:line="276" w:lineRule="auto"/>
-        <w:jc w:val="both"/>
-        <w:rPr>
-          <w:rFonts w:ascii="Times New Roman" w:hAnsi="Times New Roman"/>
-          <w:bCs/>
-          <w:color w:val="000000" w:themeColor="text1"/>
-          <w:sz w:val="26"/>
-          <w:szCs w:val="26"/>
-          <w:lang w:val="vi-VN"/>
-        </w:rPr>
-      </w:pPr>
-      <w:r>
-        <w:rPr>
-          <w:rFonts w:ascii="Times New Roman" w:hAnsi="Times New Roman"/>
-          <w:bCs/>
-          <w:color w:val="000000" w:themeColor="text1"/>
-          <w:sz w:val="26"/>
-          <w:szCs w:val="26"/>
-          <w:lang w:val="vi-VN"/>
-        </w:rPr>
-        <w:t>Xem báo cáo, thống kê hiệu quả truyền thông tổng thể.</w:t>
-      </w:r>
-    </w:p>
-    <w:p>
-      <w:pPr>
-        <w:pStyle w:val="ListParagraph"/>
+        <w:pStyle w:val="oancuaDanhsach"/>
         <w:numPr>
           <w:ilvl w:val="0"/>
           <w:numId w:val="18"/>
@@ -5125,149 +4732,32 @@
         </w:rPr>
       </w:pPr>
       <w:r>
+        <w:rPr>
+          <w:lang w:val="vi-VN"/>
+        </w:rPr>
         <w:t>Biên tập viên (Ban Tuyên giáo Công đoàn): Soạn thảo, biên tập nội dung, tiếp nhận hàng đợi duyệt bài, sử dụng AI Copilot CMS tối ưu SEO/tóm tắt/ảnh banner, thiết lập lịch đăng bài, xuất bản đa kênh Facebook và thẩm định chấm điểm thi đua 16 Tổ.</w:t>
       </w:r>
     </w:p>
     <w:p>
       <w:pPr>
-        <w:pStyle w:val="ListParagraph"/>
-        <w:numPr>
-          <w:ilvl w:val="0"/>
-          <w:numId w:val="19"/>
-        </w:numPr>
-        <w:shd w:val="clear" w:color="auto" w:fill="FFFFFF" w:themeFill="background1"/>
-        <w:spacing w:line="276" w:lineRule="auto"/>
-        <w:jc w:val="both"/>
-        <w:rPr>
-          <w:rFonts w:ascii="Times New Roman" w:hAnsi="Times New Roman"/>
-          <w:bCs/>
-          <w:color w:val="000000" w:themeColor="text1"/>
-          <w:sz w:val="26"/>
-          <w:szCs w:val="26"/>
-          <w:lang w:val="vi-VN"/>
-        </w:rPr>
-      </w:pPr>
-      <w:r>
-        <w:rPr>
-          <w:rFonts w:ascii="Times New Roman" w:hAnsi="Times New Roman"/>
-          <w:bCs/>
-          <w:color w:val="000000" w:themeColor="text1"/>
-          <w:sz w:val="26"/>
-          <w:szCs w:val="26"/>
-          <w:lang w:val="vi-VN"/>
-        </w:rPr>
-        <w:t>Soạn thảo, biên tập bài viết bằng trình soạn thảo trực quan.</w:t>
-      </w:r>
-    </w:p>
-    <w:p>
-      <w:pPr>
-        <w:pStyle w:val="ListParagraph"/>
-        <w:numPr>
-          <w:ilvl w:val="0"/>
-          <w:numId w:val="19"/>
-        </w:numPr>
-        <w:shd w:val="clear" w:color="auto" w:fill="FFFFFF" w:themeFill="background1"/>
-        <w:spacing w:line="276" w:lineRule="auto"/>
-        <w:jc w:val="both"/>
-        <w:rPr>
-          <w:rFonts w:ascii="Times New Roman" w:hAnsi="Times New Roman"/>
-          <w:bCs/>
-          <w:color w:val="000000" w:themeColor="text1"/>
-          <w:sz w:val="26"/>
-          <w:szCs w:val="26"/>
-          <w:lang w:val="vi-VN"/>
-        </w:rPr>
-      </w:pPr>
-      <w:r>
-        <w:rPr>
-          <w:rFonts w:ascii="Times New Roman" w:hAnsi="Times New Roman"/>
-          <w:bCs/>
-          <w:color w:val="000000" w:themeColor="text1"/>
-          <w:sz w:val="26"/>
-          <w:szCs w:val="26"/>
-          <w:lang w:val="vi-VN"/>
-        </w:rPr>
-        <w:t>Sử dụng AI hỗ trợ tạo nội dung văn bản, hình ảnh, video minh họa cho bài viết.</w:t>
-      </w:r>
-    </w:p>
-    <w:p>
-      <w:pPr>
-        <w:pStyle w:val="ListParagraph"/>
-        <w:numPr>
-          <w:ilvl w:val="0"/>
-          <w:numId w:val="19"/>
-        </w:numPr>
-        <w:shd w:val="clear" w:color="auto" w:fill="FFFFFF" w:themeFill="background1"/>
-        <w:spacing w:line="276" w:lineRule="auto"/>
-        <w:jc w:val="both"/>
-        <w:rPr>
-          <w:rFonts w:ascii="Times New Roman" w:hAnsi="Times New Roman"/>
-          <w:bCs/>
-          <w:color w:val="000000" w:themeColor="text1"/>
-          <w:sz w:val="26"/>
-          <w:szCs w:val="26"/>
-          <w:lang w:val="vi-VN"/>
-        </w:rPr>
-      </w:pPr>
-      <w:r>
-        <w:rPr>
-          <w:rFonts w:ascii="Times New Roman" w:hAnsi="Times New Roman"/>
-          <w:bCs/>
-          <w:color w:val="000000" w:themeColor="text1"/>
-          <w:sz w:val="26"/>
-          <w:szCs w:val="26"/>
-          <w:lang w:val="vi-VN"/>
-        </w:rPr>
-        <w:t>Thiết lập lịch đăng bài (ngày giờ, kênh đăng: Website và/hoặc Fanpage).</w:t>
-      </w:r>
-    </w:p>
-    <w:p>
-      <w:pPr>
-        <w:pStyle w:val="ListParagraph"/>
-        <w:numPr>
-          <w:ilvl w:val="0"/>
-          <w:numId w:val="19"/>
-        </w:numPr>
-        <w:shd w:val="clear" w:color="auto" w:fill="FFFFFF" w:themeFill="background1"/>
-        <w:spacing w:line="276" w:lineRule="auto"/>
-        <w:jc w:val="both"/>
-        <w:rPr>
-          <w:rFonts w:ascii="Times New Roman" w:hAnsi="Times New Roman"/>
-          <w:bCs/>
-          <w:color w:val="000000" w:themeColor="text1"/>
-          <w:sz w:val="26"/>
-          <w:szCs w:val="26"/>
-          <w:lang w:val="vi-VN"/>
-        </w:rPr>
-      </w:pPr>
-      <w:r>
-        <w:rPr>
-          <w:rFonts w:ascii="Times New Roman" w:hAnsi="Times New Roman"/>
-          <w:bCs/>
-          <w:color w:val="000000" w:themeColor="text1"/>
-          <w:sz w:val="26"/>
-          <w:szCs w:val="26"/>
-          <w:lang w:val="vi-VN"/>
-        </w:rPr>
-        <w:t>Theo dõi trạng thái bài viết (nháp / chờ đăng / đã đăng).</w:t>
-      </w:r>
-    </w:p>
-    <w:p>
-      <w:pPr>
-        <w:pStyle w:val="ListParagraph"/>
+        <w:pStyle w:val="oancuaDanhsach"/>
         <w:spacing w:before="20" w:after="40"/>
+        <w:rPr>
+          <w:lang w:val="vi-VN"/>
+        </w:rPr>
       </w:pPr>
       <w:r>
         <w:rPr>
           <w:rFonts w:ascii="Times New Roman" w:hAnsi="Times New Roman"/>
           <w:sz w:val="20"/>
+          <w:lang w:val="vi-VN"/>
         </w:rPr>
         <w:t>Cộng tác viên (Đại diện 16 Tổ Công đoàn): Soạn thảo bài viết bản nháp, sử dụng Trợ lý AI gợi ý nội dung, nộp bài yêu cầu phê duyệt và nộp báo cáo hoạt động thi đua tháng của Tổ online kèm minh chứng.</w:t>
       </w:r>
     </w:p>
     <w:p>
       <w:pPr>
-        <w:pStyle w:val="ListParagraph"/>
+        <w:pStyle w:val="oancuaDanhsach"/>
         <w:numPr>
           <w:ilvl w:val="0"/>
           <w:numId w:val="18"/>
@@ -5286,74 +4776,15 @@
         </w:rPr>
       </w:pPr>
       <w:r>
+        <w:rPr>
+          <w:lang w:val="vi-VN"/>
+        </w:rPr>
         <w:t>Hệ thống (tự động): Tự động xuất bản bài viết theo lịch hẹn giờ, tự động đồng bộ đăng bài kèm ảnh sang Fanpage Facebook Công đoàn qua Graph API, tự động tính điểm và xếp hạng thi đua 16 Tổ, tự động sao lưu CSDL định kỳ.</w:t>
       </w:r>
     </w:p>
     <w:p>
       <w:pPr>
-        <w:pStyle w:val="ListParagraph"/>
-        <w:numPr>
-          <w:ilvl w:val="0"/>
-          <w:numId w:val="19"/>
-        </w:numPr>
-        <w:shd w:val="clear" w:color="auto" w:fill="FFFFFF" w:themeFill="background1"/>
-        <w:spacing w:line="276" w:lineRule="auto"/>
-        <w:jc w:val="both"/>
-        <w:rPr>
-          <w:rFonts w:ascii="Times New Roman" w:hAnsi="Times New Roman"/>
-          <w:bCs/>
-          <w:color w:val="000000" w:themeColor="text1"/>
-          <w:sz w:val="26"/>
-          <w:szCs w:val="26"/>
-          <w:lang w:val="vi-VN"/>
-        </w:rPr>
-      </w:pPr>
-      <w:r>
-        <w:rPr>
-          <w:rFonts w:ascii="Times New Roman" w:hAnsi="Times New Roman"/>
-          <w:bCs/>
-          <w:color w:val="000000" w:themeColor="text1"/>
-          <w:sz w:val="26"/>
-          <w:szCs w:val="26"/>
-          <w:lang w:val="vi-VN"/>
-        </w:rPr>
-        <w:t>Tự động đăng tải bài viết đúng thời điểm đã lên lịch lên Website và Fanpage Công đoàn.</w:t>
-      </w:r>
-    </w:p>
-    <w:p>
-      <w:pPr>
-        <w:pStyle w:val="ListParagraph"/>
-        <w:numPr>
-          <w:ilvl w:val="0"/>
-          <w:numId w:val="19"/>
-        </w:numPr>
-        <w:shd w:val="clear" w:color="auto" w:fill="FFFFFF" w:themeFill="background1"/>
-        <w:spacing w:line="276" w:lineRule="auto"/>
-        <w:jc w:val="both"/>
-        <w:rPr>
-          <w:rFonts w:ascii="Times New Roman" w:hAnsi="Times New Roman"/>
-          <w:bCs/>
-          <w:color w:val="000000" w:themeColor="text1"/>
-          <w:sz w:val="26"/>
-          <w:szCs w:val="26"/>
-          <w:lang w:val="vi-VN"/>
-        </w:rPr>
-      </w:pPr>
-      <w:r>
-        <w:rPr>
-          <w:rFonts w:ascii="Times New Roman" w:hAnsi="Times New Roman"/>
-          <w:bCs/>
-          <w:color w:val="000000" w:themeColor="text1"/>
-          <w:sz w:val="26"/>
-          <w:szCs w:val="26"/>
-          <w:lang w:val="vi-VN"/>
-        </w:rPr>
-        <w:t>Tự động thu thập, tổng hợp số liệu tương tác (lượt xem, lượt like, lượt share, lượt bình luận) vào một dashboard thống kê.</w:t>
-      </w:r>
-    </w:p>
-    <w:p>
-      <w:pPr>
-        <w:pStyle w:val="ListParagraph"/>
+        <w:pStyle w:val="oancuaDanhsach"/>
         <w:numPr>
           <w:ilvl w:val="0"/>
           <w:numId w:val="18"/>
@@ -5372,21 +4803,19 @@
         </w:rPr>
       </w:pPr>
       <w:r>
+        <w:rPr>
+          <w:lang w:val="vi-VN"/>
+        </w:rPr>
         <w:t>Đoàn viên &amp; Độc giả (cán bộ, giảng viên, nhân viên, sinh viên): Xem và tìm kiếm tin tức đa tiêu chí, tải văn bản biểu mẫu chính sách, gửi phản ánh tâm tư nguyện vọng, tham gia bình chọn thăm dò ý kiến và tương tác bài viết (Like, bình luận, chia sẻ).</w:t>
       </w:r>
     </w:p>
     <w:p>
       <w:pPr>
-        <w:pStyle w:val="ListParagraph"/>
-        <w:numPr>
-          <w:ilvl w:val="0"/>
-          <w:numId w:val="19"/>
-        </w:numPr>
         <w:shd w:val="clear" w:color="auto" w:fill="FFFFFF" w:themeFill="background1"/>
         <w:spacing w:line="276" w:lineRule="auto"/>
         <w:jc w:val="both"/>
         <w:rPr>
-          <w:rFonts w:ascii="Times New Roman" w:hAnsi="Times New Roman"/>
+          <w:b/>
           <w:bCs/>
           <w:color w:val="000000" w:themeColor="text1"/>
           <w:sz w:val="26"/>
@@ -5396,46 +4825,23 @@
       </w:pPr>
       <w:r>
         <w:rPr>
-          <w:rFonts w:ascii="Times New Roman" w:hAnsi="Times New Roman"/>
-          <w:bCs/>
-          <w:color w:val="000000" w:themeColor="text1"/>
-          <w:sz w:val="26"/>
-          <w:szCs w:val="26"/>
-          <w:lang w:val="vi-VN"/>
-        </w:rPr>
-        <w:t>Xem, tìm kiếm nội dung truyền thông công khai trên Website.</w:t>
-      </w:r>
-    </w:p>
-    <w:p>
-      <w:pPr>
-        <w:pStyle w:val="ListParagraph"/>
-        <w:numPr>
-          <w:ilvl w:val="0"/>
-          <w:numId w:val="19"/>
-        </w:numPr>
+          <w:lang w:val="vi-VN"/>
+        </w:rPr>
+        <w:t>Khả năng ứng dụng: Triển khai ứng dụng thực tế trực tiếp trong công tác truyền thông và phong trào thi đua của Công đoàn Trường Đại học Thủ Dầu Một, giúp rút ngắn thời gian tạo nội dung nhờ AI hỗ trợ, số hóa minh bạch công tác thi đua 16 Tổ công đoàn trực thuộc, thống nhất quản lý lịch đăng đa kênh và cung cấp công cụ thống kê tập trung để đánh giá hiệu quả truyền thông. Mô hình có khả năng mở rộng áp dụng cho các đơn vị/phòng ban khác trong trường hoặc các tổ chức Công đoàn cơ sở, Đoàn Thanh niên trong hệ thống giáo dục đại học.</w:t>
+      </w:r>
+    </w:p>
+    <w:p>
+      <w:pPr>
         <w:shd w:val="clear" w:color="auto" w:fill="FFFFFF" w:themeFill="background1"/>
         <w:spacing w:line="276" w:lineRule="auto"/>
         <w:jc w:val="both"/>
         <w:rPr>
-          <w:rFonts w:ascii="Times New Roman" w:hAnsi="Times New Roman"/>
-          <w:bCs/>
-          <w:color w:val="000000" w:themeColor="text1"/>
-          <w:sz w:val="26"/>
-          <w:szCs w:val="26"/>
-          <w:lang w:val="vi-VN"/>
-        </w:rPr>
-      </w:pPr>
-      <w:r>
-        <w:rPr>
-          <w:rFonts w:ascii="Times New Roman" w:hAnsi="Times New Roman"/>
-          <w:bCs/>
-          <w:color w:val="000000" w:themeColor="text1"/>
-          <w:sz w:val="26"/>
-          <w:szCs w:val="26"/>
-          <w:lang w:val="vi-VN"/>
-        </w:rPr>
-        <w:t>Tương tác với nội dung trên Fanpage (like, share, bình luận).</w:t>
-      </w:r>
+          <w:b/>
+          <w:bCs/>
+          <w:sz w:val="26"/>
+          <w:szCs w:val="26"/>
+        </w:rPr>
+      </w:pPr>
     </w:p>
     <w:p>
       <w:pPr>
@@ -5445,33 +4851,14 @@
         <w:rPr>
           <w:b/>
           <w:bCs/>
-          <w:color w:val="000000" w:themeColor="text1"/>
-          <w:sz w:val="26"/>
-          <w:szCs w:val="26"/>
-          <w:lang w:val="vi-VN"/>
-        </w:rPr>
-      </w:pPr>
-      <w:r>
-        <w:t>Khả năng ứng dụng: Triển khai ứng dụng thực tế trực tiếp trong công tác truyền thông và phong trào thi đua của Công đoàn Trường Đại học Thủ Dầu Một, giúp rút ngắn thời gian tạo nội dung nhờ AI hỗ trợ, số hóa minh bạch công tác thi đua 16 Tổ công đoàn trực thuộc, thống nhất quản lý lịch đăng đa kênh và cung cấp công cụ thống kê tập trung để đánh giá hiệu quả truyền thông. Mô hình có khả năng mở rộng áp dụng cho các đơn vị/phòng ban khác trong trường hoặc các tổ chức Công đoàn cơ sở, Đoàn Thanh niên trong hệ thống giáo dục đại học.</w:t>
-      </w:r>
-    </w:p>
-    <w:p>
-      <w:pPr>
-        <w:shd w:val="clear" w:color="auto" w:fill="FFFFFF" w:themeFill="background1"/>
-        <w:spacing w:line="276" w:lineRule="auto"/>
-        <w:jc w:val="both"/>
-        <w:rPr>
-          <w:b/>
-          <w:bCs/>
-          <w:sz w:val="26"/>
-          <w:szCs w:val="26"/>
-          <w:lang w:val="vi-VN"/>
-        </w:rPr>
-      </w:pPr>
-    </w:p>
-    <w:p>
-      <w:pPr>
-        <w:pStyle w:val="BodyText"/>
+          <w:sz w:val="26"/>
+          <w:szCs w:val="26"/>
+        </w:rPr>
+      </w:pPr>
+    </w:p>
+    <w:p>
+      <w:pPr>
+        <w:pStyle w:val="ThnVnban"/>
         <w:numPr>
           <w:ilvl w:val="0"/>
           <w:numId w:val="1"/>
@@ -5494,6 +4881,7 @@
           <w:szCs w:val="26"/>
           <w:lang w:val="vi-VN"/>
         </w:rPr>
+        <w:lastRenderedPageBreak/>
         <w:t>Kinh phí thực hiện đề tài:</w:t>
       </w:r>
       <w:r>
@@ -5537,13 +4925,12 @@
           <w:szCs w:val="26"/>
           <w:lang w:val="vi-VN"/>
         </w:rPr>
-        <w:lastRenderedPageBreak/>
         <w:t>Bằng chữ: Bốn triệu chín trăm ngàn đồng.</w:t>
       </w:r>
     </w:p>
     <w:p>
       <w:pPr>
-        <w:pStyle w:val="BodyText"/>
+        <w:pStyle w:val="ThnVnban"/>
         <w:tabs>
           <w:tab w:val="center" w:pos="2268"/>
           <w:tab w:val="center" w:pos="7371"/>
@@ -5560,7 +4947,7 @@
     </w:p>
     <w:p>
       <w:pPr>
-        <w:pStyle w:val="BodyText"/>
+        <w:pStyle w:val="ThnVnban"/>
         <w:tabs>
           <w:tab w:val="center" w:pos="2268"/>
           <w:tab w:val="center" w:pos="7371"/>
@@ -5596,7 +4983,7 @@
           <w:lang w:val="vi-VN"/>
         </w:rPr>
         <w:tab/>
-        <w:t xml:space="preserve">Ngày 02 tháng </w:t>
+        <w:t>Ngày 2</w:t>
       </w:r>
       <w:r>
         <w:rPr>
@@ -5607,7 +4994,7 @@
           <w:szCs w:val="26"/>
           <w:lang w:val="en-US"/>
         </w:rPr>
-        <w:t>09</w:t>
+        <w:t>4</w:t>
       </w:r>
       <w:r>
         <w:rPr>
@@ -5618,243 +5005,9 @@
           <w:szCs w:val="26"/>
           <w:lang w:val="vi-VN"/>
         </w:rPr>
-        <w:t xml:space="preserve"> năm 2026</w:t>
-      </w:r>
-    </w:p>
-    <w:p>
-      <w:pPr>
-        <w:pStyle w:val="BodyText"/>
-        <w:tabs>
-          <w:tab w:val="center" w:pos="2268"/>
-          <w:tab w:val="center" w:pos="7371"/>
-        </w:tabs>
-        <w:spacing w:line="276" w:lineRule="auto"/>
-        <w:jc w:val="left"/>
-        <w:rPr>
-          <w:rFonts w:ascii="Times New Roman" w:hAnsi="Times New Roman"/>
-          <w:bCs/>
-          <w:szCs w:val="26"/>
-          <w:lang w:val="vi-VN"/>
-        </w:rPr>
-      </w:pPr>
-      <w:r>
-        <w:rPr>
-          <w:rFonts w:ascii="Times New Roman" w:hAnsi="Times New Roman"/>
-          <w:bCs/>
-          <w:szCs w:val="26"/>
-          <w:lang w:val="vi-VN"/>
-        </w:rPr>
-        <w:tab/>
-        <w:t>Giáo viên hướng dẫn</w:t>
-      </w:r>
-      <w:r>
-        <w:rPr>
-          <w:rFonts w:ascii="Times New Roman" w:hAnsi="Times New Roman"/>
-          <w:bCs/>
-          <w:szCs w:val="26"/>
-          <w:lang w:val="vi-VN"/>
-        </w:rPr>
-        <w:tab/>
-      </w:r>
-      <w:r>
-        <w:rPr>
-          <w:rFonts w:ascii="Times New Roman" w:hAnsi="Times New Roman"/>
-          <w:bCs/>
-          <w:iCs/>
-          <w:szCs w:val="26"/>
-          <w:lang w:val="vi-VN"/>
-        </w:rPr>
-        <w:t>Sinh viên</w:t>
-      </w:r>
-    </w:p>
-    <w:p>
-      <w:pPr>
-        <w:pStyle w:val="BodyText"/>
-        <w:tabs>
-          <w:tab w:val="center" w:pos="2268"/>
-          <w:tab w:val="center" w:pos="7371"/>
-        </w:tabs>
-        <w:spacing w:line="276" w:lineRule="auto"/>
-        <w:jc w:val="left"/>
-        <w:rPr>
-          <w:rFonts w:ascii="Times New Roman" w:hAnsi="Times New Roman"/>
-          <w:b w:val="0"/>
-          <w:szCs w:val="26"/>
-          <w:lang w:val="vi-VN"/>
-        </w:rPr>
-      </w:pPr>
-      <w:r>
-        <w:rPr>
-          <w:rFonts w:ascii="Times New Roman" w:hAnsi="Times New Roman"/>
-          <w:bCs/>
-          <w:szCs w:val="26"/>
-          <w:lang w:val="vi-VN"/>
-        </w:rPr>
-        <w:tab/>
-        <w:t xml:space="preserve"> đề tài</w:t>
-      </w:r>
-      <w:r>
-        <w:rPr>
-          <w:rFonts w:ascii="Times New Roman" w:hAnsi="Times New Roman"/>
-          <w:bCs/>
-          <w:szCs w:val="26"/>
-          <w:lang w:val="vi-VN"/>
-        </w:rPr>
-        <w:tab/>
-      </w:r>
-      <w:r>
-        <w:rPr>
-          <w:rFonts w:ascii="Times New Roman" w:hAnsi="Times New Roman"/>
-          <w:iCs/>
-          <w:szCs w:val="26"/>
-          <w:lang w:val="vi-VN"/>
-        </w:rPr>
-        <w:t>chịu trách nhiệm chính</w:t>
-      </w:r>
-      <w:r>
-        <w:rPr>
-          <w:rFonts w:ascii="Times New Roman" w:hAnsi="Times New Roman"/>
-          <w:b w:val="0"/>
-          <w:szCs w:val="26"/>
-          <w:lang w:val="vi-VN"/>
-        </w:rPr>
-        <w:tab/>
-        <w:t>Ký, ghi rõ họ tên )</w:t>
-      </w:r>
-      <w:r>
-        <w:rPr>
-          <w:rFonts w:ascii="Times New Roman" w:hAnsi="Times New Roman"/>
-          <w:b w:val="0"/>
-          <w:szCs w:val="26"/>
-          <w:lang w:val="vi-VN"/>
-        </w:rPr>
-        <w:tab/>
-        <w:t>(Ký, ghi rõ họ tên)</w:t>
-      </w:r>
-    </w:p>
-    <w:p>
-      <w:pPr>
-        <w:tabs>
-          <w:tab w:val="center" w:pos="2268"/>
-          <w:tab w:val="center" w:pos="7371"/>
-        </w:tabs>
-        <w:spacing w:line="276" w:lineRule="auto"/>
-        <w:rPr>
-          <w:sz w:val="26"/>
-          <w:szCs w:val="26"/>
-          <w:lang w:val="vi-VN"/>
-        </w:rPr>
-      </w:pPr>
-    </w:p>
-    <w:p>
-      <w:pPr>
-        <w:tabs>
-          <w:tab w:val="center" w:pos="2268"/>
-          <w:tab w:val="center" w:pos="7371"/>
-        </w:tabs>
-        <w:spacing w:line="276" w:lineRule="auto"/>
-        <w:rPr>
-          <w:sz w:val="26"/>
-          <w:szCs w:val="26"/>
-          <w:lang w:val="vi-VN"/>
-        </w:rPr>
-      </w:pPr>
-    </w:p>
-    <w:p>
-      <w:pPr>
-        <w:tabs>
-          <w:tab w:val="center" w:pos="2268"/>
-          <w:tab w:val="center" w:pos="7371"/>
-        </w:tabs>
-        <w:spacing w:line="276" w:lineRule="auto"/>
-        <w:rPr>
-          <w:sz w:val="26"/>
-          <w:szCs w:val="26"/>
-          <w:lang w:val="vi-VN"/>
-        </w:rPr>
-      </w:pPr>
-    </w:p>
-    <w:p>
-      <w:pPr>
-        <w:tabs>
-          <w:tab w:val="center" w:pos="2268"/>
-          <w:tab w:val="center" w:pos="7371"/>
-        </w:tabs>
-        <w:spacing w:line="276" w:lineRule="auto"/>
-        <w:rPr>
-          <w:b/>
-          <w:bCs/>
-          <w:sz w:val="26"/>
-          <w:szCs w:val="26"/>
-          <w:lang w:val="vi-VN"/>
-        </w:rPr>
-      </w:pPr>
-      <w:r>
-        <w:rPr>
-          <w:b/>
-          <w:bCs/>
-          <w:sz w:val="26"/>
-          <w:szCs w:val="26"/>
-          <w:lang w:val="vi-VN"/>
-        </w:rPr>
-        <w:tab/>
-        <w:t xml:space="preserve">Võ Quốc Lương </w:t>
-      </w:r>
-      <w:r>
-        <w:rPr>
-          <w:b/>
-          <w:bCs/>
-          <w:sz w:val="26"/>
-          <w:szCs w:val="26"/>
-          <w:lang w:val="vi-VN"/>
-        </w:rPr>
-        <w:tab/>
-      </w:r>
-      <w:r>
-        <w:rPr>
-          <w:b/>
-          <w:bCs/>
-          <w:color w:val="000000" w:themeColor="text1"/>
-          <w:sz w:val="26"/>
-          <w:szCs w:val="26"/>
-          <w:lang w:val="vi-VN"/>
-        </w:rPr>
-        <w:t>Nguyễn Bình Dương</w:t>
-      </w:r>
-    </w:p>
-    <w:p>
-      <w:pPr>
-        <w:tabs>
-          <w:tab w:val="center" w:pos="2268"/>
-          <w:tab w:val="center" w:pos="7371"/>
-        </w:tabs>
-        <w:spacing w:line="276" w:lineRule="auto"/>
-        <w:rPr>
-          <w:sz w:val="26"/>
-          <w:szCs w:val="26"/>
-          <w:lang w:val="vi-VN"/>
-        </w:rPr>
-      </w:pPr>
-    </w:p>
-    <w:p>
-      <w:pPr>
-        <w:tabs>
-          <w:tab w:val="center" w:pos="2268"/>
-          <w:tab w:val="center" w:pos="7371"/>
-        </w:tabs>
-        <w:spacing w:line="276" w:lineRule="auto"/>
-        <w:rPr>
-          <w:sz w:val="26"/>
-          <w:szCs w:val="26"/>
-          <w:lang w:val="vi-VN"/>
-        </w:rPr>
-      </w:pPr>
-    </w:p>
-    <w:p>
-      <w:pPr>
-        <w:pStyle w:val="BodyText"/>
-        <w:spacing w:line="276" w:lineRule="auto"/>
-        <w:jc w:val="center"/>
+        <w:t xml:space="preserve"> tháng </w:t>
+      </w:r>
+      <w:r>
         <w:rPr>
           <w:rFonts w:ascii="Times New Roman" w:hAnsi="Times New Roman"/>
           <w:b w:val="0"/>
@@ -5863,18 +5016,7 @@
           <w:szCs w:val="26"/>
           <w:lang w:val="vi-VN"/>
         </w:rPr>
-      </w:pPr>
-      <w:r>
-        <w:rPr>
-          <w:rFonts w:ascii="Times New Roman" w:hAnsi="Times New Roman"/>
-          <w:b w:val="0"/>
-          <w:bCs/>
-          <w:i/>
-          <w:color w:val="000000"/>
-          <w:szCs w:val="26"/>
-          <w:lang w:val="vi-VN"/>
-        </w:rPr>
-        <w:t>Thành phố Hồ Chí Minh</w:t>
+        <w:t>09</w:t>
       </w:r>
       <w:r>
         <w:rPr>
@@ -5885,16 +5027,283 @@
           <w:szCs w:val="26"/>
           <w:lang w:val="vi-VN"/>
         </w:rPr>
-        <w:t xml:space="preserve">, ngày …… tháng </w:t>
-      </w:r>
-      <w:r>
+        <w:t xml:space="preserve"> năm 2026</w:t>
+      </w:r>
+    </w:p>
+    <w:p>
+      <w:pPr>
+        <w:pStyle w:val="ThnVnban"/>
+        <w:tabs>
+          <w:tab w:val="center" w:pos="2268"/>
+          <w:tab w:val="center" w:pos="7371"/>
+        </w:tabs>
+        <w:spacing w:line="276" w:lineRule="auto"/>
+        <w:jc w:val="left"/>
+        <w:rPr>
+          <w:rFonts w:ascii="Times New Roman" w:hAnsi="Times New Roman"/>
+          <w:bCs/>
+          <w:szCs w:val="26"/>
+          <w:lang w:val="vi-VN"/>
+        </w:rPr>
+      </w:pPr>
+      <w:r>
+        <w:rPr>
+          <w:rFonts w:ascii="Times New Roman" w:hAnsi="Times New Roman"/>
+          <w:bCs/>
+          <w:szCs w:val="26"/>
+          <w:lang w:val="vi-VN"/>
+        </w:rPr>
+        <w:tab/>
+        <w:t>Giáo viên hướng dẫn</w:t>
+      </w:r>
+      <w:r>
+        <w:rPr>
+          <w:rFonts w:ascii="Times New Roman" w:hAnsi="Times New Roman"/>
+          <w:bCs/>
+          <w:szCs w:val="26"/>
+          <w:lang w:val="vi-VN"/>
+        </w:rPr>
+        <w:tab/>
+      </w:r>
+      <w:r>
+        <w:rPr>
+          <w:rFonts w:ascii="Times New Roman" w:hAnsi="Times New Roman"/>
+          <w:bCs/>
+          <w:iCs/>
+          <w:szCs w:val="26"/>
+          <w:lang w:val="vi-VN"/>
+        </w:rPr>
+        <w:t>Sinh viên</w:t>
+      </w:r>
+    </w:p>
+    <w:p>
+      <w:pPr>
+        <w:pStyle w:val="ThnVnban"/>
+        <w:tabs>
+          <w:tab w:val="center" w:pos="2268"/>
+          <w:tab w:val="center" w:pos="7371"/>
+        </w:tabs>
+        <w:spacing w:line="276" w:lineRule="auto"/>
+        <w:jc w:val="left"/>
+        <w:rPr>
+          <w:rFonts w:ascii="Times New Roman" w:hAnsi="Times New Roman"/>
+          <w:b w:val="0"/>
+          <w:szCs w:val="26"/>
+          <w:lang w:val="vi-VN"/>
+        </w:rPr>
+      </w:pPr>
+      <w:r>
+        <w:rPr>
+          <w:rFonts w:ascii="Times New Roman" w:hAnsi="Times New Roman"/>
+          <w:bCs/>
+          <w:szCs w:val="26"/>
+          <w:lang w:val="vi-VN"/>
+        </w:rPr>
+        <w:tab/>
+        <w:t xml:space="preserve"> đề tài</w:t>
+      </w:r>
+      <w:r>
+        <w:rPr>
+          <w:rFonts w:ascii="Times New Roman" w:hAnsi="Times New Roman"/>
+          <w:bCs/>
+          <w:szCs w:val="26"/>
+          <w:lang w:val="vi-VN"/>
+        </w:rPr>
+        <w:tab/>
+      </w:r>
+      <w:r>
+        <w:rPr>
+          <w:rFonts w:ascii="Times New Roman" w:hAnsi="Times New Roman"/>
+          <w:iCs/>
+          <w:szCs w:val="26"/>
+          <w:lang w:val="vi-VN"/>
+        </w:rPr>
+        <w:t>chịu trách nhiệm chính</w:t>
+      </w:r>
+      <w:r>
+        <w:rPr>
+          <w:rFonts w:ascii="Times New Roman" w:hAnsi="Times New Roman"/>
+          <w:b w:val="0"/>
+          <w:szCs w:val="26"/>
+          <w:lang w:val="vi-VN"/>
+        </w:rPr>
+        <w:tab/>
+        <w:t>Ký, ghi rõ họ tên )</w:t>
+      </w:r>
+      <w:r>
+        <w:rPr>
+          <w:rFonts w:ascii="Times New Roman" w:hAnsi="Times New Roman"/>
+          <w:b w:val="0"/>
+          <w:szCs w:val="26"/>
+          <w:lang w:val="vi-VN"/>
+        </w:rPr>
+        <w:tab/>
+        <w:t>(Ký, ghi rõ họ tên)</w:t>
+      </w:r>
+    </w:p>
+    <w:p>
+      <w:pPr>
+        <w:tabs>
+          <w:tab w:val="center" w:pos="2268"/>
+          <w:tab w:val="center" w:pos="7371"/>
+        </w:tabs>
+        <w:spacing w:line="276" w:lineRule="auto"/>
+        <w:rPr>
+          <w:sz w:val="26"/>
+          <w:szCs w:val="26"/>
+          <w:lang w:val="vi-VN"/>
+        </w:rPr>
+      </w:pPr>
+    </w:p>
+    <w:p>
+      <w:pPr>
+        <w:tabs>
+          <w:tab w:val="center" w:pos="2268"/>
+          <w:tab w:val="center" w:pos="7371"/>
+        </w:tabs>
+        <w:spacing w:line="276" w:lineRule="auto"/>
+        <w:rPr>
+          <w:sz w:val="26"/>
+          <w:szCs w:val="26"/>
+          <w:lang w:val="vi-VN"/>
+        </w:rPr>
+      </w:pPr>
+    </w:p>
+    <w:p>
+      <w:pPr>
+        <w:tabs>
+          <w:tab w:val="center" w:pos="2268"/>
+          <w:tab w:val="center" w:pos="7371"/>
+        </w:tabs>
+        <w:spacing w:line="276" w:lineRule="auto"/>
+        <w:rPr>
+          <w:sz w:val="26"/>
+          <w:szCs w:val="26"/>
+          <w:lang w:val="vi-VN"/>
+        </w:rPr>
+      </w:pPr>
+    </w:p>
+    <w:p>
+      <w:pPr>
+        <w:tabs>
+          <w:tab w:val="center" w:pos="2268"/>
+          <w:tab w:val="center" w:pos="7371"/>
+        </w:tabs>
+        <w:spacing w:line="276" w:lineRule="auto"/>
+        <w:rPr>
+          <w:b/>
+          <w:bCs/>
+          <w:sz w:val="26"/>
+          <w:szCs w:val="26"/>
+          <w:lang w:val="vi-VN"/>
+        </w:rPr>
+      </w:pPr>
+      <w:r>
+        <w:rPr>
+          <w:b/>
+          <w:bCs/>
+          <w:sz w:val="26"/>
+          <w:szCs w:val="26"/>
+          <w:lang w:val="vi-VN"/>
+        </w:rPr>
+        <w:tab/>
+        <w:t xml:space="preserve">Võ Quốc Lương </w:t>
+      </w:r>
+      <w:r>
+        <w:rPr>
+          <w:b/>
+          <w:bCs/>
+          <w:sz w:val="26"/>
+          <w:szCs w:val="26"/>
+          <w:lang w:val="vi-VN"/>
+        </w:rPr>
+        <w:tab/>
+      </w:r>
+      <w:r>
+        <w:rPr>
+          <w:b/>
+          <w:bCs/>
+          <w:color w:val="000000" w:themeColor="text1"/>
+          <w:sz w:val="26"/>
+          <w:szCs w:val="26"/>
+          <w:lang w:val="vi-VN"/>
+        </w:rPr>
+        <w:t>Nguyễn Bình Dương</w:t>
+      </w:r>
+    </w:p>
+    <w:p>
+      <w:pPr>
+        <w:tabs>
+          <w:tab w:val="center" w:pos="2268"/>
+          <w:tab w:val="center" w:pos="7371"/>
+        </w:tabs>
+        <w:spacing w:line="276" w:lineRule="auto"/>
+        <w:rPr>
+          <w:sz w:val="26"/>
+          <w:szCs w:val="26"/>
+          <w:lang w:val="vi-VN"/>
+        </w:rPr>
+      </w:pPr>
+    </w:p>
+    <w:p>
+      <w:pPr>
+        <w:tabs>
+          <w:tab w:val="center" w:pos="2268"/>
+          <w:tab w:val="center" w:pos="7371"/>
+        </w:tabs>
+        <w:spacing w:line="276" w:lineRule="auto"/>
+        <w:rPr>
+          <w:sz w:val="26"/>
+          <w:szCs w:val="26"/>
+          <w:lang w:val="vi-VN"/>
+        </w:rPr>
+      </w:pPr>
+    </w:p>
+    <w:p>
+      <w:pPr>
+        <w:pStyle w:val="ThnVnban"/>
+        <w:spacing w:line="276" w:lineRule="auto"/>
+        <w:jc w:val="center"/>
         <w:rPr>
           <w:rFonts w:ascii="Times New Roman" w:hAnsi="Times New Roman"/>
           <w:b w:val="0"/>
           <w:i/>
           <w:iCs/>
           <w:szCs w:val="26"/>
-          <w:lang w:val="en-US"/>
+          <w:lang w:val="vi-VN"/>
+        </w:rPr>
+      </w:pPr>
+      <w:r>
+        <w:rPr>
+          <w:rFonts w:ascii="Times New Roman" w:hAnsi="Times New Roman"/>
+          <w:b w:val="0"/>
+          <w:bCs/>
+          <w:i/>
+          <w:color w:val="000000"/>
+          <w:szCs w:val="26"/>
+          <w:lang w:val="vi-VN"/>
+        </w:rPr>
+        <w:t>Thành phố Hồ Chí Minh</w:t>
+      </w:r>
+      <w:r>
+        <w:rPr>
+          <w:rFonts w:ascii="Times New Roman" w:hAnsi="Times New Roman"/>
+          <w:b w:val="0"/>
+          <w:i/>
+          <w:iCs/>
+          <w:szCs w:val="26"/>
+          <w:lang w:val="vi-VN"/>
+        </w:rPr>
+        <w:t xml:space="preserve">, ngày …… tháng </w:t>
+      </w:r>
+      <w:r>
+        <w:rPr>
+          <w:rFonts w:ascii="Times New Roman" w:hAnsi="Times New Roman"/>
+          <w:b w:val="0"/>
+          <w:i/>
+          <w:iCs/>
+          <w:szCs w:val="26"/>
+          <w:lang w:val="vi-VN"/>
         </w:rPr>
         <w:t>09</w:t>
       </w:r>
@@ -5995,10 +5404,10 @@
 <w:ftr xmlns:wpc="http://schemas.microsoft.com/office/word/2010/wordprocessingCanvas" xmlns:cx="http://schemas.microsoft.com/office/drawing/2014/chartex" xmlns:cx1="http://schemas.microsoft.com/office/drawing/2015/9/8/chartex" xmlns:cx2="http://schemas.microsoft.com/office/drawing/2015/10/21/chartex" xmlns:cx3="http://schemas.microsoft.com/office/drawing/2016/5/9/chartex" xmlns:cx4="http://schemas.microsoft.com/office/drawing/2016/5/10/chartex" xmlns:cx5="http://schemas.microsoft.com/office/drawing/2016/5/11/chartex" xmlns:cx6="http://schemas.microsoft.com/office/drawing/2016/5/12/chartex" xmlns:cx7="http://schemas.microsoft.com/office/drawing/2016/5/13/chartex" xmlns:cx8="http://schemas.microsoft.com/office/drawing/2016/5/14/chartex" xmlns:mc="http://schemas.openxmlformats.org/markup-compatibility/2006" xmlns:aink="http://schemas.microsoft.com/office/drawing/2016/ink" xmlns:am3d="http://schemas.microsoft.com/office/drawing/2017/model3d" xmlns:o="urn:schemas-microsoft-com:office:office" xmlns:oel="http://schemas.microsoft.com/office/2019/extlst" xmlns:r="http://schemas.openxmlformats.org/officeDocument/2006/relationships" xmlns:m="http://schemas.openxmlformats.org/officeDocument/2006/math" xmlns:v="urn:schemas-microsoft-com:vml" xmlns:wp14="http://schemas.microsoft.com/office/word/2010/wordprocessingDrawing" xmlns:wp="http://schemas.openxmlformats.org/drawingml/2006/wordprocessingDrawing" xmlns:w10="urn:schemas-microsoft-com:office:word" xmlns:w="http://schemas.openxmlformats.org/wordprocessingml/2006/main" xmlns:w14="http://schemas.microsoft.com/office/word/2010/wordml" xmlns:w15="http://schemas.microsoft.com/office/word/2012/wordml" xmlns:w16cex="http://schemas.microsoft.com/office/word/2018/wordml/cex" xmlns:w16cid="http://schemas.microsoft.com/office/word/2016/wordml/cid" xmlns:w16="http://schemas.microsoft.com/office/word/2018/wordml" xmlns:w16du="http://schemas.microsoft.com/office/word/2023/wordml/word16du" xmlns:w16sdtdh="http://schemas.microsoft.com/office/word/2020/wordml/sdtdatahash" xmlns:w16sdtfl="http://schemas.microsoft.com/office/word/2024/wordml/sdtformatlock" xmlns:w16se="http://schemas.microsoft.com/office/word/2015/wordml/symex" xmlns:wpg="http://schemas.microsoft.com/office/word/2010/wordprocessingGroup" xmlns:wpi="http://schemas.microsoft.com/office/word/2010/wordprocessingInk" xmlns:wne="http://schemas.microsoft.com/office/word/2006/wordml" xmlns:wps="http://schemas.microsoft.com/office/word/2010/wordprocessingShape" mc:Ignorable="w14 w15 w16se w16cid w16 w16cex w16sdtdh w16sdtfl w16du wp14">
   <w:p>
     <w:pPr>
-      <w:pStyle w:val="Footer"/>
+      <w:pStyle w:val="Chntrang"/>
       <w:framePr w:wrap="around" w:vAnchor="text" w:hAnchor="margin" w:xAlign="center" w:y="1"/>
       <w:rPr>
-        <w:rStyle w:val="PageNumber"/>
+        <w:rStyle w:val="Strang"/>
       </w:rPr>
     </w:pPr>
     <w:r>
@@ -6006,7 +5415,7 @@
     </w:r>
     <w:r>
       <w:rPr>
-        <w:rStyle w:val="PageNumber"/>
+        <w:rStyle w:val="Strang"/>
       </w:rPr>
       <w:instrText xml:space="preserve">PAGE  </w:instrText>
     </w:r>
@@ -6016,7 +5425,7 @@
   </w:p>
   <w:p>
     <w:pPr>
-      <w:pStyle w:val="Footer"/>
+      <w:pStyle w:val="Chntrang"/>
       <w:ind w:right="360"/>
     </w:pPr>
   </w:p>
@@ -6027,7 +5436,7 @@
 <w:ftr xmlns:wpc="http://schemas.microsoft.com/office/word/2010/wordprocessingCanvas" xmlns:cx="http://schemas.microsoft.com/office/drawing/2014/chartex" xmlns:cx1="http://schemas.microsoft.com/office/drawing/2015/9/8/chartex" xmlns:cx2="http://schemas.microsoft.com/office/drawing/2015/10/21/chartex" xmlns:cx3="http://schemas.microsoft.com/office/drawing/2016/5/9/chartex" xmlns:cx4="http://schemas.microsoft.com/office/drawing/2016/5/10/chartex" xmlns:cx5="http://schemas.microsoft.com/office/drawing/2016/5/11/chartex" xmlns:cx6="http://schemas.microsoft.com/office/drawing/2016/5/12/chartex" xmlns:cx7="http://schemas.microsoft.com/office/drawing/2016/5/13/chartex" xmlns:cx8="http://schemas.microsoft.com/office/drawing/2016/5/14/chartex" xmlns:mc="http://schemas.openxmlformats.org/markup-compatibility/2006" xmlns:aink="http://schemas.microsoft.com/office/drawing/2016/ink" xmlns:am3d="http://schemas.microsoft.com/office/drawing/2017/model3d" xmlns:o="urn:schemas-microsoft-com:office:office" xmlns:oel="http://schemas.microsoft.com/office/2019/extlst" xmlns:r="http://schemas.openxmlformats.org/officeDocument/2006/relationships" xmlns:m="http://schemas.openxmlformats.org/officeDocument/2006/math" xmlns:v="urn:schemas-microsoft-com:vml" xmlns:wp14="http://schemas.microsoft.com/office/word/2010/wordprocessingDrawing" xmlns:wp="http://schemas.openxmlformats.org/drawingml/2006/wordprocessingDrawing" xmlns:w10="urn:schemas-microsoft-com:office:word" xmlns:w="http://schemas.openxmlformats.org/wordprocessingml/2006/main" xmlns:w14="http://schemas.microsoft.com/office/word/2010/wordml" xmlns:w15="http://schemas.microsoft.com/office/word/2012/wordml" xmlns:w16cex="http://schemas.microsoft.com/office/word/2018/wordml/cex" xmlns:w16cid="http://schemas.microsoft.com/office/word/2016/wordml/cid" xmlns:w16="http://schemas.microsoft.com/office/word/2018/wordml" xmlns:w16du="http://schemas.microsoft.com/office/word/2023/wordml/word16du" xmlns:w16sdtdh="http://schemas.microsoft.com/office/word/2020/wordml/sdtdatahash" xmlns:w16sdtfl="http://schemas.microsoft.com/office/word/2024/wordml/sdtformatlock" xmlns:w16se="http://schemas.microsoft.com/office/word/2015/wordml/symex" xmlns:wpg="http://schemas.microsoft.com/office/word/2010/wordprocessingGroup" xmlns:wpi="http://schemas.microsoft.com/office/word/2010/wordprocessingInk" xmlns:wne="http://schemas.microsoft.com/office/word/2006/wordml" xmlns:wps="http://schemas.microsoft.com/office/word/2010/wordprocessingShape" mc:Ignorable="w14 w15 w16se w16cid w16 w16cex w16sdtdh w16sdtfl w16du wp14">
   <w:p>
     <w:pPr>
-      <w:pStyle w:val="Footer"/>
+      <w:pStyle w:val="Chntrang"/>
       <w:jc w:val="center"/>
       <w:rPr>
         <w:color w:val="FFFFFF" w:themeColor="background1"/>
@@ -6042,7 +5451,7 @@
   </w:p>
   <w:p>
     <w:pPr>
-      <w:pStyle w:val="Footer"/>
+      <w:pStyle w:val="Chntrang"/>
       <w:rPr>
         <w:lang w:val="en-US"/>
       </w:rPr>
@@ -6065,7 +5474,7 @@
     <w:sdtContent>
       <w:p>
         <w:pPr>
-          <w:pStyle w:val="Footer"/>
+          <w:pStyle w:val="Chntrang"/>
           <w:jc w:val="center"/>
           <w:rPr>
             <w:rFonts w:ascii="Times New Roman" w:hAnsi="Times New Roman"/>
@@ -6106,7 +5515,7 @@
   </w:sdt>
   <w:p>
     <w:pPr>
-      <w:pStyle w:val="Footer"/>
+      <w:pStyle w:val="Chntrang"/>
       <w:rPr>
         <w:lang w:val="en-US"/>
       </w:rPr>
@@ -9640,7 +9049,7 @@
     <w:lsdException w:name="Unresolved Mention" w:semiHidden="1" w:uiPriority="99" w:unhideWhenUsed="1"/>
     <w:lsdException w:name="Smart Link" w:semiHidden="1" w:uiPriority="99" w:unhideWhenUsed="1"/>
   </w:latentStyles>
-  <w:style w:type="paragraph" w:default="1" w:styleId="Normal">
+  <w:style w:type="paragraph" w:default="1" w:styleId="Binhthng">
     <w:name w:val="Normal"/>
     <w:qFormat/>
     <w:rPr>
@@ -9649,11 +9058,11 @@
       <w:szCs w:val="24"/>
     </w:rPr>
   </w:style>
-  <w:style w:type="paragraph" w:styleId="Heading1">
+  <w:style w:type="paragraph" w:styleId="u1">
     <w:name w:val="heading 1"/>
-    <w:basedOn w:val="Normal"/>
-    <w:next w:val="Normal"/>
-    <w:link w:val="Heading1Char"/>
+    <w:basedOn w:val="Binhthng"/>
+    <w:next w:val="Binhthng"/>
+    <w:link w:val="u1Char"/>
     <w:qFormat/>
     <w:pPr>
       <w:keepNext/>
@@ -9668,9 +9077,9 @@
       <w:szCs w:val="32"/>
     </w:rPr>
   </w:style>
-  <w:style w:type="paragraph" w:styleId="Heading3">
+  <w:style w:type="paragraph" w:styleId="u3">
     <w:name w:val="heading 3"/>
-    <w:next w:val="Normal"/>
+    <w:next w:val="Binhthng"/>
     <w:semiHidden/>
     <w:unhideWhenUsed/>
     <w:qFormat/>
@@ -9687,10 +9096,10 @@
       <w:lang w:eastAsia="zh-CN"/>
     </w:rPr>
   </w:style>
-  <w:style w:type="paragraph" w:styleId="Heading4">
+  <w:style w:type="paragraph" w:styleId="u4">
     <w:name w:val="heading 4"/>
-    <w:basedOn w:val="Normal"/>
-    <w:next w:val="Normal"/>
+    <w:basedOn w:val="Binhthng"/>
+    <w:next w:val="Binhthng"/>
     <w:qFormat/>
     <w:pPr>
       <w:keepNext/>
@@ -9703,10 +9112,10 @@
       <w:lang w:val="en-GB"/>
     </w:rPr>
   </w:style>
-  <w:style w:type="paragraph" w:styleId="Heading5">
+  <w:style w:type="paragraph" w:styleId="u5">
     <w:name w:val="heading 5"/>
-    <w:basedOn w:val="Normal"/>
-    <w:next w:val="Normal"/>
+    <w:basedOn w:val="Binhthng"/>
+    <w:next w:val="Binhthng"/>
     <w:qFormat/>
     <w:pPr>
       <w:keepNext/>
@@ -9721,10 +9130,10 @@
       <w:lang w:val="en-GB"/>
     </w:rPr>
   </w:style>
-  <w:style w:type="paragraph" w:styleId="Heading7">
+  <w:style w:type="paragraph" w:styleId="u7">
     <w:name w:val="heading 7"/>
-    <w:basedOn w:val="Normal"/>
-    <w:next w:val="Normal"/>
+    <w:basedOn w:val="Binhthng"/>
+    <w:next w:val="Binhthng"/>
     <w:qFormat/>
     <w:pPr>
       <w:keepNext/>
@@ -9740,13 +9149,13 @@
       <w:lang w:val="en-GB"/>
     </w:rPr>
   </w:style>
-  <w:style w:type="character" w:default="1" w:styleId="DefaultParagraphFont">
+  <w:style w:type="character" w:default="1" w:styleId="Phngmcinhcuaoanvn">
     <w:name w:val="Default Paragraph Font"/>
     <w:uiPriority w:val="1"/>
     <w:semiHidden/>
     <w:unhideWhenUsed/>
   </w:style>
-  <w:style w:type="table" w:default="1" w:styleId="TableNormal">
+  <w:style w:type="table" w:default="1" w:styleId="BangThngthng">
     <w:name w:val="Normal Table"/>
     <w:uiPriority w:val="99"/>
     <w:semiHidden/>
@@ -9761,15 +9170,15 @@
       </w:tblCellMar>
     </w:tblPr>
   </w:style>
-  <w:style w:type="numbering" w:default="1" w:styleId="NoList">
+  <w:style w:type="numbering" w:default="1" w:styleId="Khngco">
     <w:name w:val="No List"/>
     <w:uiPriority w:val="99"/>
     <w:semiHidden/>
     <w:unhideWhenUsed/>
   </w:style>
-  <w:style w:type="paragraph" w:styleId="BodyText">
+  <w:style w:type="paragraph" w:styleId="ThnVnban">
     <w:name w:val="Body Text"/>
-    <w:basedOn w:val="Normal"/>
+    <w:basedOn w:val="Binhthng"/>
     <w:qFormat/>
     <w:pPr>
       <w:jc w:val="both"/>
@@ -9782,10 +9191,10 @@
       <w:lang w:val="en-GB"/>
     </w:rPr>
   </w:style>
-  <w:style w:type="paragraph" w:styleId="Footer">
+  <w:style w:type="paragraph" w:styleId="Chntrang">
     <w:name w:val="footer"/>
-    <w:basedOn w:val="Normal"/>
-    <w:link w:val="FooterChar"/>
+    <w:basedOn w:val="Binhthng"/>
+    <w:link w:val="ChntrangChar"/>
     <w:uiPriority w:val="99"/>
     <w:qFormat/>
     <w:pPr>
@@ -9801,9 +9210,9 @@
       <w:lang w:val="en-GB"/>
     </w:rPr>
   </w:style>
-  <w:style w:type="paragraph" w:styleId="Header">
+  <w:style w:type="paragraph" w:styleId="utrang">
     <w:name w:val="header"/>
-    <w:basedOn w:val="Normal"/>
+    <w:basedOn w:val="Binhthng"/>
     <w:qFormat/>
     <w:pPr>
       <w:tabs>
@@ -9812,32 +9221,32 @@
       </w:tabs>
     </w:pPr>
   </w:style>
-  <w:style w:type="character" w:styleId="Hyperlink">
+  <w:style w:type="character" w:styleId="Siuktni">
     <w:name w:val="Hyperlink"/>
-    <w:basedOn w:val="DefaultParagraphFont"/>
+    <w:basedOn w:val="Phngmcinhcuaoanvn"/>
     <w:qFormat/>
     <w:rPr>
       <w:color w:val="0000FF"/>
       <w:u w:val="single"/>
     </w:rPr>
   </w:style>
-  <w:style w:type="paragraph" w:styleId="NormalWeb">
+  <w:style w:type="paragraph" w:styleId="ThngthngWeb">
     <w:name w:val="Normal (Web)"/>
-    <w:basedOn w:val="Normal"/>
+    <w:basedOn w:val="Binhthng"/>
     <w:semiHidden/>
     <w:qFormat/>
     <w:pPr>
       <w:spacing w:before="100" w:beforeAutospacing="1" w:after="100" w:afterAutospacing="1"/>
     </w:pPr>
   </w:style>
-  <w:style w:type="character" w:styleId="PageNumber">
+  <w:style w:type="character" w:styleId="Strang">
     <w:name w:val="page number"/>
-    <w:basedOn w:val="DefaultParagraphFont"/>
+    <w:basedOn w:val="Phngmcinhcuaoanvn"/>
     <w:qFormat/>
   </w:style>
-  <w:style w:type="character" w:styleId="Strong">
+  <w:style w:type="character" w:styleId="Manh">
     <w:name w:val="Strong"/>
-    <w:basedOn w:val="DefaultParagraphFont"/>
+    <w:basedOn w:val="Phngmcinhcuaoanvn"/>
     <w:qFormat/>
     <w:rPr>
       <w:b/>
@@ -9846,7 +9255,7 @@
   </w:style>
   <w:style w:type="paragraph" w:customStyle="1" w:styleId="Char">
     <w:name w:val="Char"/>
-    <w:basedOn w:val="Normal"/>
+    <w:basedOn w:val="Binhthng"/>
     <w:qFormat/>
     <w:pPr>
       <w:spacing w:after="160" w:line="240" w:lineRule="exact"/>
@@ -9857,9 +9266,9 @@
       <w:szCs w:val="20"/>
     </w:rPr>
   </w:style>
-  <w:style w:type="paragraph" w:styleId="ListParagraph">
+  <w:style w:type="paragraph" w:styleId="oancuaDanhsach">
     <w:name w:val="List Paragraph"/>
-    <w:basedOn w:val="Normal"/>
+    <w:basedOn w:val="Binhthng"/>
     <w:uiPriority w:val="34"/>
     <w:qFormat/>
     <w:pPr>
@@ -9873,10 +9282,10 @@
       <w:szCs w:val="22"/>
     </w:rPr>
   </w:style>
-  <w:style w:type="character" w:customStyle="1" w:styleId="FooterChar">
-    <w:name w:val="Footer Char"/>
-    <w:basedOn w:val="DefaultParagraphFont"/>
-    <w:link w:val="Footer"/>
+  <w:style w:type="character" w:customStyle="1" w:styleId="ChntrangChar">
+    <w:name w:val="Chân trang Char"/>
+    <w:basedOn w:val="Phngmcinhcuaoanvn"/>
+    <w:link w:val="Chntrang"/>
     <w:uiPriority w:val="99"/>
     <w:qFormat/>
     <w:rPr>
@@ -9885,10 +9294,10 @@
       <w:lang w:val="en-GB"/>
     </w:rPr>
   </w:style>
-  <w:style w:type="character" w:customStyle="1" w:styleId="Heading1Char">
-    <w:name w:val="Heading 1 Char"/>
-    <w:basedOn w:val="DefaultParagraphFont"/>
-    <w:link w:val="Heading1"/>
+  <w:style w:type="character" w:customStyle="1" w:styleId="u1Char">
+    <w:name w:val="Đầu đề 1 Char"/>
+    <w:basedOn w:val="Phngmcinhcuaoanvn"/>
+    <w:link w:val="u1"/>
     <w:qFormat/>
     <w:rPr>
       <w:rFonts w:asciiTheme="majorHAnsi" w:eastAsiaTheme="majorEastAsia" w:hAnsiTheme="majorHAnsi" w:cstheme="majorBidi"/>
@@ -9899,7 +9308,7 @@
   </w:style>
   <w:style w:type="paragraph" w:customStyle="1" w:styleId="nd">
     <w:name w:val=".nd"/>
-    <w:basedOn w:val="NormalWeb"/>
+    <w:basedOn w:val="ThngthngWeb"/>
     <w:qFormat/>
     <w:rsid w:val="005E496B"/>
     <w:pPr>
@@ -10174,6 +9583,10 @@
 </file>
 
 <file path=customXml/item1.xml><?xml version="1.0" encoding="utf-8"?>
+<b:Sources xmlns:b="http://schemas.openxmlformats.org/officeDocument/2006/bibliography" xmlns="http://schemas.openxmlformats.org/officeDocument/2006/bibliography" SelectedStyle="\APASixthEditionOfficeOnline.xsl" StyleName="APA" Version="6"/>
+</file>
+
+<file path=customXml/item2.xml><?xml version="1.0" encoding="utf-8"?>
 <s:customData xmlns="http://www.wps.cn/officeDocument/2013/wpsCustomData" xmlns:s="http://www.wps.cn/officeDocument/2013/wpsCustomData">
   <customSectProps>
     <customSectPr/>
@@ -10184,22 +9597,18 @@
 </s:customData>
 </file>
 
-<file path=customXml/item2.xml><?xml version="1.0" encoding="utf-8"?>
-<b:Sources xmlns:b="http://schemas.openxmlformats.org/officeDocument/2006/bibliography" xmlns="http://schemas.openxmlformats.org/officeDocument/2006/bibliography" SelectedStyle="\APASixthEditionOfficeOnline.xsl" StyleName="APA" Version="6"/>
+<file path=customXml/itemProps1.xml><?xml version="1.0" encoding="utf-8"?>
+<ds:datastoreItem xmlns:ds="http://schemas.openxmlformats.org/officeDocument/2006/customXml" ds:itemID="{EB1C289B-4E46-4ACB-8DEF-6AFE43709B45}">
+  <ds:schemaRefs>
+    <ds:schemaRef ds:uri="http://schemas.openxmlformats.org/officeDocument/2006/bibliography"/>
+  </ds:schemaRefs>
+</ds:datastoreItem>
 </file>
 
-<file path=customXml/itemProps1.xml><?xml version="1.0" encoding="utf-8"?>
+<file path=customXml/itemProps2.xml><?xml version="1.0" encoding="utf-8"?>
 <ds:datastoreItem xmlns:ds="http://schemas.openxmlformats.org/officeDocument/2006/customXml" ds:itemID="{B1977F7D-205B-4081-913C-38D41E755F92}">
   <ds:schemaRefs>
     <ds:schemaRef ds:uri="http://www.wps.cn/officeDocument/2013/wpsCustomData"/>
   </ds:schemaRefs>
 </ds:datastoreItem>
-</file>
-
-<file path=customXml/itemProps2.xml><?xml version="1.0" encoding="utf-8"?>
-<ds:datastoreItem xmlns:ds="http://schemas.openxmlformats.org/officeDocument/2006/customXml" ds:itemID="{EB1C289B-4E46-4ACB-8DEF-6AFE43709B45}">
-  <ds:schemaRefs>
-    <ds:schemaRef ds:uri="http://schemas.openxmlformats.org/officeDocument/2006/bibliography"/>
-  </ds:schemaRefs>
-</ds:datastoreItem>
 </file>
</xml_diff>

<commit_message>
docs: chuan hoa de cuong NCKH thanh 3 chuong tong quan - xay dung - tong ket gop theo chuan de cuong TDMU
</commit_message>
<xml_diff>
--- a/docs/2.Nguyễn Bình Dương_Xay Dung Website Truyen Thong Cong Doan TDMU Tich Hop AI Ho Tro Tao Va Dang Tai Noi Dung_De cuong.docx
+++ b/docs/2.Nguyễn Bình Dương_Xay Dung Website Truyen Thong Cong Doan TDMU Tich Hop AI Ho Tro Tao Va Dang Tai Noi Dung_De cuong.docx
@@ -3732,12 +3732,11 @@
       </w:pPr>
       <w:r>
         <w:rPr>
+          <w:rFonts w:ascii="Times New Roman" w:hAnsi="Times New Roman" w:cs="Times New Roman" w:eastAsia="Times New Roman"/>
           <w:b/>
           <w:sz w:val="26"/>
-          <w:szCs w:val="26"/>
-          <w:lang w:val="vi-VN"/>
-        </w:rPr>
-        <w:t>Chương 1: Tổng quan và khảo sát hiện trạng</w:t>
+        </w:rPr>
+        <w:t>Chương 1: Tổng quan</w:t>
       </w:r>
     </w:p>
     <w:p>
@@ -3752,12 +3751,11 @@
       </w:pPr>
       <w:r>
         <w:rPr>
-          <w:rFonts w:ascii="Times New Roman" w:hAnsi="Times New Roman"/>
-          <w:sz w:val="26"/>
-          <w:szCs w:val="26"/>
-          <w:lang w:val="vi-VN"/>
-        </w:rPr>
-        <w:t>1.1. Khảo sát hiện trạng công tác truyền thông tại Công đoàn TDMU (khó khăn kiêm nhiệm, phân tán kênh, thiếu công cụ đo lường)</w:t>
+          <w:rFonts w:ascii="Times New Roman" w:hAnsi="Times New Roman" w:cs="Times New Roman" w:eastAsia="Times New Roman"/>
+          <w:b w:val="0"/>
+          <w:sz w:val="26"/>
+        </w:rPr>
+        <w:t>1.1. Lý do chọn đề tài và tính cấp thiết</w:t>
       </w:r>
     </w:p>
     <w:p>
@@ -3772,12 +3770,11 @@
       </w:pPr>
       <w:r>
         <w:rPr>
-          <w:rFonts w:ascii="Times New Roman" w:hAnsi="Times New Roman"/>
-          <w:sz w:val="26"/>
-          <w:szCs w:val="26"/>
-          <w:lang w:val="vi-VN"/>
-        </w:rPr>
-        <w:t>1.2. Khảo sát phần cứng và hạ tầng công nghệ</w:t>
+          <w:rFonts w:ascii="Times New Roman" w:hAnsi="Times New Roman" w:cs="Times New Roman" w:eastAsia="Times New Roman"/>
+          <w:b w:val="0"/>
+          <w:sz w:val="26"/>
+        </w:rPr>
+        <w:t>1.2. Mục đích và nhiệm vụ nghiên cứu</w:t>
       </w:r>
     </w:p>
     <w:p>
@@ -3792,12 +3789,11 @@
       </w:pPr>
       <w:r>
         <w:rPr>
-          <w:rFonts w:ascii="Times New Roman" w:hAnsi="Times New Roman"/>
-          <w:sz w:val="26"/>
-          <w:szCs w:val="26"/>
-          <w:lang w:val="vi-VN"/>
-        </w:rPr>
-        <w:t>1.3. Khảo sát nhu cầu (Kế hoạch khảo sát và biên bản phỏng vấn thực tế với Lãnh đạo Công đoàn và Biên tập viên)</w:t>
+          <w:rFonts w:ascii="Times New Roman" w:hAnsi="Times New Roman" w:cs="Times New Roman" w:eastAsia="Times New Roman"/>
+          <w:b w:val="0"/>
+          <w:sz w:val="26"/>
+        </w:rPr>
+        <w:t>1.3. Phạm vi và đối tượng nghiên cứu</w:t>
       </w:r>
     </w:p>
     <w:p>
@@ -3812,12 +3808,11 @@
       </w:pPr>
       <w:r>
         <w:rPr>
-          <w:rFonts w:ascii="Times New Roman" w:hAnsi="Times New Roman"/>
-          <w:sz w:val="26"/>
-          <w:szCs w:val="26"/>
-          <w:lang w:val="vi-VN"/>
-        </w:rPr>
-        <w:t>1.4. Phân tích yêu cầu hệ thống (Yêu cầu phía người dùng và Yêu cầu phía quản lý)</w:t>
+          <w:rFonts w:ascii="Times New Roman" w:hAnsi="Times New Roman" w:cs="Times New Roman" w:eastAsia="Times New Roman"/>
+          <w:b w:val="0"/>
+          <w:sz w:val="26"/>
+        </w:rPr>
+        <w:t>1.4. Phương pháp nghiên cứu</w:t>
       </w:r>
     </w:p>
     <w:p>
@@ -3832,12 +3827,11 @@
       </w:pPr>
       <w:r>
         <w:rPr>
-          <w:rFonts w:ascii="Times New Roman" w:hAnsi="Times New Roman"/>
-          <w:sz w:val="26"/>
-          <w:szCs w:val="26"/>
-          <w:lang w:val="vi-VN"/>
-        </w:rPr>
-        <w:t>1.5. Phân tích chức năng hệ thống (Danh mục chức năng người dùng và Danh mục chức năng người quản trị)</w:t>
+          <w:rFonts w:ascii="Times New Roman" w:hAnsi="Times New Roman" w:cs="Times New Roman" w:eastAsia="Times New Roman"/>
+          <w:b w:val="0"/>
+          <w:sz w:val="26"/>
+        </w:rPr>
+        <w:t>1.5. Khảo sát thực trạng công tác truyền thông tại Công đoàn TDMU (khó khăn kiêm nhiệm, phân tán kênh, hạ tầng CNTT và kết quả phỏng vấn nhu cầu thực tế)</w:t>
       </w:r>
     </w:p>
     <w:p>
@@ -3855,7 +3849,7 @@
           <w:b/>
           <w:sz w:val="26"/>
         </w:rPr>
-        <w:t>Chương 2: Phân tích hệ thống theo chuẩn UML</w:t>
+        <w:t>Chương 2: Xây dựng ứng dụng</w:t>
       </w:r>
     </w:p>
     <w:p>
@@ -3869,11 +3863,11 @@
       </w:pPr>
       <w:r>
         <w:rPr>
-          <w:rFonts w:ascii="Times New Roman" w:hAnsi="Times New Roman"/>
-          <w:sz w:val="26"/>
-          <w:szCs w:val="26"/>
-        </w:rPr>
-        <w:t>2.1. Danh sách và cấu trúc phân cấp các Actor (4 Actor con người: Admin, Editor, Contributor, User + 3 Actor dịch vụ ngoài)</w:t>
+          <w:rFonts w:ascii="Times New Roman" w:hAnsi="Times New Roman" w:cs="Times New Roman" w:eastAsia="Times New Roman"/>
+          <w:b w:val="0"/>
+          <w:sz w:val="26"/>
+        </w:rPr>
+        <w:t>2.1. Xây dựng các yêu cầu và đặc tả chức năng (Yêu cầu chức năng và phi chức năng, phân cấp 4 Actor: Admin, Editor, Contributor, User + 3 Actor dịch vụ ngoài, danh mục 26 Use Case)</w:t>
       </w:r>
     </w:p>
     <w:p>
@@ -3887,11 +3881,11 @@
       </w:pPr>
       <w:r>
         <w:rPr>
-          <w:rFonts w:ascii="Times New Roman" w:hAnsi="Times New Roman"/>
-          <w:sz w:val="26"/>
-          <w:szCs w:val="26"/>
-        </w:rPr>
-        <w:t>2.2. Danh mục 26 Use Case chức năng hệ thống</w:t>
+          <w:rFonts w:ascii="Times New Roman" w:hAnsi="Times New Roman" w:cs="Times New Roman" w:eastAsia="Times New Roman"/>
+          <w:b w:val="0"/>
+          <w:sz w:val="26"/>
+        </w:rPr>
+        <w:t>2.2. Phân tích và thiết kế hệ thống theo chuẩn UML (Biểu đồ Use Case tổng quát và 6 phân hệ phân rã, Ma trận quan hệ &lt;&lt;include&gt;&gt;, &lt;&lt;extend&gt;&gt; &amp; phân quyền CRUD, Biểu đồ tuần tự Sequence Diagram các luồng nghiệp vụ cốt lõi)</w:t>
       </w:r>
     </w:p>
     <w:p>
@@ -3905,11 +3899,11 @@
       </w:pPr>
       <w:r>
         <w:rPr>
-          <w:rFonts w:ascii="Times New Roman" w:hAnsi="Times New Roman"/>
-          <w:sz w:val="26"/>
-          <w:szCs w:val="26"/>
-        </w:rPr>
-        <w:t>2.3. Ma trận quan hệ Use Case (&lt;&lt;include&gt;&gt;, &lt;&lt;extend&gt;&gt;) và Ma trận phân quyền CRUD</w:t>
+          <w:rFonts w:ascii="Times New Roman" w:hAnsi="Times New Roman" w:cs="Times New Roman" w:eastAsia="Times New Roman"/>
+          <w:b w:val="0"/>
+          <w:sz w:val="26"/>
+        </w:rPr>
+        <w:t>2.3. Thiết kế cơ sở dữ liệu quan hệ và kiến trúc phần mềm (Sơ đồ thực thể liên kết ERD, Thiết kế chi tiết 15 bảng MSSQL chuẩn hóa: ORGANIZATIONS, UNION_BRANCHES, MEMBERS, CATEGORIES, ARTICLES, DOCUMENTS, MONTHLY_REPORTS, SCHEDULES, USERS, ARTICLE_AUDITS, COMMENTS, BOOKMARKS, WELFARE_PROGRAMS, AID_REQUESTS, INBOX_FEEDBACK, Kiến trúc 3 tầng Client-Server)</w:t>
       </w:r>
     </w:p>
     <w:p>
@@ -3923,11 +3917,11 @@
       </w:pPr>
       <w:r>
         <w:rPr>
-          <w:rFonts w:ascii="Times New Roman" w:hAnsi="Times New Roman"/>
-          <w:sz w:val="26"/>
-          <w:szCs w:val="26"/>
-        </w:rPr>
-        <w:t>2.4. Biểu đồ Use Case tổng quát và 6 Biểu đồ Use Case phân rã kèm Bảng đặc tả 8 mục chi tiết chuẩn Cockburn</w:t>
+          <w:rFonts w:ascii="Times New Roman" w:hAnsi="Times New Roman" w:cs="Times New Roman" w:eastAsia="Times New Roman"/>
+          <w:b w:val="0"/>
+          <w:sz w:val="26"/>
+        </w:rPr>
+        <w:t>2.4. Xây dựng ứng dụng và tích hợp công nghệ hiện đại (Phát triển Frontend React 18 SPA, Backend Node.js Express RESTful API, Tích hợp Trợ lý Google Gemini Pro/Flash API hỗ trợ viết bài/tóm tắt/banner, Kết nối Meta Facebook Graph API v19.0 xuất bản tự động, Phân hệ quản lý thi đua và chấm điểm 16 Tổ công đoàn)</w:t>
       </w:r>
     </w:p>
     <w:p>
@@ -3941,11 +3935,11 @@
       </w:pPr>
       <w:r>
         <w:rPr>
-          <w:rFonts w:ascii="Times New Roman" w:hAnsi="Times New Roman"/>
-          <w:sz w:val="26"/>
-          <w:szCs w:val="26"/>
-        </w:rPr>
-        <w:t>2.5. Biểu đồ tuần tự (Sequence Diagram) mô tả các luồng nghiệp vụ cốt lõi (Đăng nhập xác thực JWT, Xuất bản AI Copilot &amp; Facebook, Nộp báo cáo &amp; Chấm điểm thi đua 16 Tổ)</w:t>
+          <w:rFonts w:ascii="Times New Roman" w:hAnsi="Times New Roman" w:cs="Times New Roman" w:eastAsia="Times New Roman"/>
+          <w:b w:val="0"/>
+          <w:sz w:val="26"/>
+        </w:rPr>
+        <w:t>2.5. Thử nghiệm và kiểm thử hệ thống (Kiểm thử chức năng Black-box testing trên 6 phân hệ, kiểm thử bảo mật xác thực JWT và đo lường hiệu năng phản hồi API)</w:t>
       </w:r>
     </w:p>
     <w:p>
@@ -3962,7 +3956,7 @@
           <w:b/>
           <w:sz w:val="26"/>
         </w:rPr>
-        <w:t>Chương 3: Cơ sở dữ liệu và thiết kế, hiện thực hệ thống</w:t>
+        <w:t>Chương 3: Tổng kết, đánh giá và hướng phát triển</w:t>
       </w:r>
     </w:p>
     <w:p>
@@ -3980,7 +3974,7 @@
           <w:b w:val="0"/>
           <w:sz w:val="26"/>
         </w:rPr>
-        <w:t>3.1. Sơ đồ thực thể liên kết (ERD) và Kiến trúc 3 tầng phân tán (React SPA - Express RESTful API - MSSQL Database)</w:t>
+        <w:t>3.1. Kết quả đạt được của đề tài (Mức độ hoàn thành các mục tiêu nghiên cứu, hoàn thiện hệ thống Website và CMS Trợ lý AI)</w:t>
       </w:r>
     </w:p>
     <w:p>
@@ -3998,7 +3992,7 @@
           <w:b w:val="0"/>
           <w:sz w:val="26"/>
         </w:rPr>
-        <w:t>3.2. Thiết kế và đặc tả chi tiết 15 bảng cơ sở dữ liệu quan hệ chuẩn hóa (ORGANIZATIONS, UNION_BRANCHES, MEMBERS, CATEGORIES, ARTICLES, DOCUMENTS, MONTHLY_REPORTS, SCHEDULES, USERS, ARTICLE_AUDITS, COMMENTS, BOOKMARKS, WELFARE_PROGRAMS, AID_REQUESTS, INBOX_FEEDBACK)</w:t>
+        <w:t>3.2. Triển khai thử nghiệm thực tế và đánh giá hiệu quả tại Công đoàn Trường ĐH Thủ Dầu Một (Kết quả đánh giá từ Ban Chấp hành, Ban Tuyên giáo và đại diện 16 Tổ công đoàn)</w:t>
       </w:r>
     </w:p>
     <w:p>
@@ -4016,7 +4010,7 @@
           <w:b w:val="0"/>
           <w:sz w:val="26"/>
         </w:rPr>
-        <w:t>3.3. Thiết kế kiến trúc tích hợp Trợ lý AI (Google Gemini Pro/Flash API) và Meta Facebook Graph API v19.0</w:t>
+        <w:t>3.3. Đánh giá ưu điểm, hạn chế và bài học kinh nghiệm</w:t>
       </w:r>
     </w:p>
     <w:p>
@@ -4034,25 +4028,7 @@
           <w:b w:val="0"/>
           <w:sz w:val="26"/>
         </w:rPr>
-        <w:t>3.4. Hiện thực hệ thống, giao diện các phân hệ cốt lõi và kết quả thực nghiệm đa kênh tích hợp AI</w:t>
-      </w:r>
-    </w:p>
-    <w:p>
-      <w:pPr>
-        <w:pStyle w:val="oancuaDanhsach"/>
-        <w:spacing w:before="20" w:after="30" w:line="276" w:lineRule="auto"/>
-        <w:rPr>
-          <w:sz w:val="26"/>
-          <w:szCs w:val="26"/>
-        </w:rPr>
-      </w:pPr>
-      <w:r>
-        <w:rPr>
-          <w:rFonts w:ascii="Times New Roman" w:hAnsi="Times New Roman" w:cs="Times New Roman" w:eastAsia="Times New Roman"/>
-          <w:b w:val="0"/>
-          <w:sz w:val="26"/>
-        </w:rPr>
-        <w:t>3.5. Đánh giá kết quả đạt được, kết luận và hướng phát triển đề tài (kết nối Zalo OA, Mobile App, AI phân tích cảm xúc phản hồi)</w:t>
+        <w:t>3.4. Hướng phát triển đề tài (Tích hợp Zalo Official Account, phát triển Mobile App đa nền tảng, ứng dụng AI phân tích cảm xúc phản hồi của đoàn viên)</w:t>
       </w:r>
     </w:p>
     <w:p>
@@ -4283,7 +4259,7 @@
                 <w:rFonts w:ascii="Times New Roman" w:hAnsi="Times New Roman" w:cs="Times New Roman" w:eastAsia="Times New Roman"/>
                 <w:sz w:val="22"/>
               </w:rPr>
-              <w:t>Khảo sát thực trạng truyền thông Công đoàn TDMU, khảo sát phần cứng hạ tầng, phân tích yêu cầu, phân tích chức năng và thực hiện Chương 1 (Tổng quan và khảo sát hiện trạng)</w:t>
+              <w:t>Thực hiện Chương 1: Tổng quan, khảo sát hiện trạng công tác truyền thông và hạ tầng CNTT tại Công đoàn Trường Đại học Thủ Dầu Một</w:t>
             </w:r>
           </w:p>
         </w:tc>
@@ -4349,7 +4325,7 @@
                 <w:rFonts w:ascii="Times New Roman" w:hAnsi="Times New Roman" w:cs="Times New Roman" w:eastAsia="Times New Roman"/>
                 <w:sz w:val="22"/>
               </w:rPr>
-              <w:t>Phân tích hệ thống theo chuẩn UML (phân cấp 4 Actor, 26 Use Case, ma trận quan hệ/CRUD, biểu đồ Use Case tổng quát/phân rã và Biểu đồ tuần tự) phục vụ Chương 2; Thiết kế giao diện Figma (UI/UX)</w:t>
+              <w:t>Phân tích và thiết kế hệ thống (Chương 2): Phân tích 4 Actor, 26 Use Case, xây dựng biểu đồ UML (Use Case, Sequence Diagram), thiết kế CSDL 15 bảng MSSQL và thiết kế giao diện Figma (UI/UX)</w:t>
             </w:r>
           </w:p>
         </w:tc>
@@ -4364,7 +4340,7 @@
                 <w:rFonts w:ascii="Times New Roman" w:hAnsi="Times New Roman" w:cs="Times New Roman" w:eastAsia="Times New Roman"/>
                 <w:sz w:val="22"/>
               </w:rPr>
-              <w:t>Tập biểu đồ UML phân tích hệ thống và bộ thiết kế giao diện Figma UI/UX hoàn chỉnh</w:t>
+              <w:t>Tập biểu đồ UML phân tích hệ thống, Sơ đồ ERD 15 bảng CSDL và bộ thiết kế giao diện Figma UI/UX hoàn chỉnh</w:t>
             </w:r>
           </w:p>
         </w:tc>
@@ -4417,7 +4393,7 @@
                 <w:rFonts w:ascii="Times New Roman" w:hAnsi="Times New Roman" w:cs="Times New Roman" w:eastAsia="Times New Roman"/>
                 <w:sz w:val="22"/>
               </w:rPr>
-              <w:t>Thiết kế CSDL 15 bảng MSSQL, kiến trúc 3 tầng, hiện thực hệ thống (Frontend React SPA, Backend Node.js Express, Tích hợp Trợ lý Gemini AI, Facebook Graph API, phân hệ thi đua 16 Tổ) phục vụ Chương 3</w:t>
+              <w:t>Xây dựng ứng dụng (Chương 2): Lập trình Frontend React SPA, Backend Node.js Express RESTful API, Tích hợp Trợ lý Gemini AI, Facebook Graph API và Phân hệ thi đua 16 Tổ công đoàn</w:t>
             </w:r>
           </w:p>
         </w:tc>
@@ -4432,7 +4408,7 @@
                 <w:rFonts w:ascii="Times New Roman" w:hAnsi="Times New Roman" w:cs="Times New Roman" w:eastAsia="Times New Roman"/>
                 <w:sz w:val="22"/>
               </w:rPr>
-              <w:t>Mã nguồn hệ thống, CSDL MSSQL và Website chạy thử nghiệm hoàn chỉnh 6 phân hệ (bản beta)</w:t>
+              <w:t>Mã nguồn hệ thống, CSDL MSSQL và Website hoàn chỉnh chạy thử nghiệm (bản beta)</w:t>
             </w:r>
           </w:p>
         </w:tc>
@@ -4485,7 +4461,7 @@
                 <w:rFonts w:ascii="Times New Roman" w:hAnsi="Times New Roman" w:cs="Times New Roman" w:eastAsia="Times New Roman"/>
                 <w:sz w:val="22"/>
               </w:rPr>
-              <w:t>Kiểm thử chức năng toàn diện 6 phân hệ, đánh giá hiệu năng thực tế, tổng kết kết quả thực nghiệm và hoàn thiện cuốn báo cáo đề tài Chương 3</w:t>
+              <w:t>Kiểm thử hệ thống và hoàn thiện báo cáo đề tài Chương 2, Chương 3: Tổng kết, đánh giá kết quả đạt được, phân tích ưu nhược điểm và hướng phát triển</w:t>
             </w:r>
           </w:p>
         </w:tc>
@@ -4500,7 +4476,7 @@
                 <w:rFonts w:ascii="Times New Roman" w:hAnsi="Times New Roman" w:cs="Times New Roman" w:eastAsia="Times New Roman"/>
                 <w:sz w:val="22"/>
               </w:rPr>
-              <w:t>Báo cáo kiểm thử hệ thống và Cuốn báo cáo NCKH hoàn chỉnh 3 chương</w:t>
+              <w:t>Báo cáo kiểm thử chức năng và Cuốn báo cáo NCKH hoàn chỉnh 3 chương</w:t>
             </w:r>
           </w:p>
         </w:tc>
@@ -4551,7 +4527,7 @@
                 <w:rFonts w:ascii="Times New Roman" w:hAnsi="Times New Roman" w:cs="Times New Roman" w:eastAsia="Times New Roman"/>
                 <w:sz w:val="22"/>
               </w:rPr>
-              <w:t>Triển khai thử nghiệm thực tế cho hoạt động truyền thông của Công đoàn TDMU, thu thập phản hồi của cán bộ đoàn viên và nghiệm thu đề tài</w:t>
+              <w:t>Triển khai thử nghiệm thực tế tại Công đoàn TDMU, thu thập kết quả đánh giá phản hồi của cán bộ đoàn viên và hoàn thiện hồ sơ nghiệm thu đề tài</w:t>
             </w:r>
           </w:p>
         </w:tc>

</xml_diff>